<commit_message>
Fixing all during tests
</commit_message>
<xml_diff>
--- a/docs/User_manual.docx
+++ b/docs/User_manual.docx
@@ -22,7 +22,7 @@
                 <v:stroke joinstyle="miter"/>
                 <v:path gradientshapeok="t" o:connecttype="rect"/>
               </v:shapetype>
-              <v:shape id="Text Box 113" o:spid="_x0000_s1030" type="#_x0000_t202" style="position:absolute;margin-left:91.8pt;margin-top:111.75pt;width:449.2pt;height:287.5pt;z-index:251660288;visibility:visible;mso-width-percent:734;mso-height-percent:363;mso-position-horizontal-relative:page;mso-position-vertical-relative:page;mso-width-percent:734;mso-height-percent:363;v-text-anchor:bottom" o:gfxdata="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" filled="f" stroked="f" strokeweight=".5pt">
+              <v:shape id="Text Box 113" o:spid="_x0000_s1030" type="#_x0000_t202" style="position:absolute;margin-left:91.8pt;margin-top:111.75pt;width:449.2pt;height:287.5pt;z-index:251657728;visibility:visible;mso-width-percent:734;mso-height-percent:363;mso-position-horizontal-relative:page;mso-position-vertical-relative:page;mso-width-percent:734;mso-height-percent:363;v-text-anchor:bottom" o:gfxdata="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" filled="f" stroked="f" strokeweight=".5pt">
                 <v:textbox style="mso-next-textbox:#Text Box 113" inset="0,0,0,0">
                   <w:txbxContent>
                     <w:p>
@@ -122,7 +122,7 @@
               <w:noProof/>
             </w:rPr>
             <w:drawing>
-              <wp:anchor distT="0" distB="0" distL="114300" distR="114300" simplePos="0" relativeHeight="251672576" behindDoc="0" locked="0" layoutInCell="1" allowOverlap="1" wp14:anchorId="7F3500F7" wp14:editId="58EC2EA4">
+              <wp:anchor distT="0" distB="0" distL="114300" distR="114300" simplePos="0" relativeHeight="251655680" behindDoc="0" locked="0" layoutInCell="1" allowOverlap="1" wp14:anchorId="7F3500F7" wp14:editId="58EC2EA4">
                 <wp:simplePos x="0" y="0"/>
                 <wp:positionH relativeFrom="column">
                   <wp:posOffset>481230</wp:posOffset>
@@ -183,7 +183,7 @@
           </w:r>
           <w:r>
             <w:pict w14:anchorId="658F56BF">
-              <v:shape id="Text Box 111" o:spid="_x0000_s1032" type="#_x0000_t202" style="position:absolute;margin-left:0;margin-top:0;width:448.8pt;height:23.45pt;z-index:251662336;visibility:visible;mso-width-percent:734;mso-height-percent:363;mso-left-percent:150;mso-top-percent:91;mso-position-horizontal-relative:page;mso-position-vertical-relative:page;mso-width-percent:734;mso-height-percent:363;mso-left-percent:150;mso-top-percent:91;v-text-anchor:bottom" o:gfxdata="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" filled="f" stroked="f" strokeweight=".5pt">
+              <v:shape id="Text Box 111" o:spid="_x0000_s1032" type="#_x0000_t202" style="position:absolute;margin-left:0;margin-top:0;width:448.8pt;height:23.45pt;z-index:251659776;visibility:visible;mso-width-percent:734;mso-height-percent:363;mso-left-percent:150;mso-top-percent:91;mso-position-horizontal-relative:page;mso-position-vertical-relative:page;mso-width-percent:734;mso-height-percent:363;mso-left-percent:150;mso-top-percent:91;v-text-anchor:bottom" o:gfxdata="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" filled="f" stroked="f" strokeweight=".5pt">
                 <v:textbox style="mso-next-textbox:#Text Box 111;mso-fit-shape-to-text:t" inset="0,0,0,0">
                   <w:txbxContent>
                     <w:sdt>
@@ -237,7 +237,7 @@
           </w:r>
           <w:r>
             <w:pict w14:anchorId="45F9FF57">
-              <v:shape id="Text Box 112" o:spid="_x0000_s1031" type="#_x0000_t202" style="position:absolute;margin-left:0;margin-top:0;width:448.8pt;height:63.35pt;z-index:251661312;visibility:visible;mso-width-percent:734;mso-height-percent:80;mso-left-percent:150;mso-top-percent:837;mso-position-horizontal-relative:page;mso-position-vertical-relative:page;mso-width-percent:734;mso-height-percent:80;mso-left-percent:150;mso-top-percent:837;v-text-anchor:bottom" o:gfxdata="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" filled="f" stroked="f" strokeweight=".5pt">
+              <v:shape id="Text Box 112" o:spid="_x0000_s1031" type="#_x0000_t202" style="position:absolute;margin-left:0;margin-top:0;width:448.8pt;height:63.35pt;z-index:251658752;visibility:visible;mso-width-percent:734;mso-height-percent:80;mso-left-percent:150;mso-top-percent:837;mso-position-horizontal-relative:page;mso-position-vertical-relative:page;mso-width-percent:734;mso-height-percent:80;mso-left-percent:150;mso-top-percent:837;v-text-anchor:bottom" o:gfxdata="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" filled="f" stroked="f" strokeweight=".5pt">
                 <v:textbox style="mso-next-textbox:#Text Box 112" inset="0,0,0,0">
                   <w:txbxContent>
                     <w:sdt>
@@ -368,7 +368,7 @@
           </w:r>
           <w:r>
             <w:pict w14:anchorId="7E02CF2F">
-              <v:group id="Group 115" o:spid="_x0000_s1027" style="position:absolute;margin-left:0;margin-top:0;width:17.75pt;height:719.8pt;z-index:251659264;mso-width-percent:29;mso-height-percent:909;mso-left-percent:45;mso-position-horizontal-relative:page;mso-position-vertical:center;mso-position-vertical-relative:page;mso-width-percent:29;mso-height-percent:909;mso-left-percent:45" coordsize="2286,91440" o:gfxdata="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">
+              <v:group id="Group 115" o:spid="_x0000_s1027" style="position:absolute;margin-left:0;margin-top:0;width:17.75pt;height:719.8pt;z-index:251656704;mso-width-percent:29;mso-height-percent:909;mso-left-percent:45;mso-position-horizontal-relative:page;mso-position-vertical:center;mso-position-vertical-relative:page;mso-width-percent:29;mso-height-percent:909;mso-left-percent:45" coordsize="2286,91440" o:gfxdata="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">
                 <v:rect id="Rectangle 115" o:spid="_x0000_s1028" style="position:absolute;width:2286;height:87820;visibility:visible;v-text-anchor:middle" o:gfxdata="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" fillcolor="#c0504d [3205]" stroked="f" strokeweight="2pt"/>
                 <v:rect id="Rectangle 116" o:spid="_x0000_s1029" style="position:absolute;top:89154;width:2286;height:2286;visibility:visible;v-text-anchor:middle" o:gfxdata="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" fillcolor="#4f81bd [3204]" stroked="f" strokeweight="2pt">
                   <o:lock v:ext="edit" aspectratio="t"/>
@@ -7113,7 +7113,31 @@
           <w:bCs/>
           <w:lang w:val="en-GB"/>
         </w:rPr>
-        <w:t>MBR3</w:t>
+        <w:t>MB</w:t>
+      </w:r>
+      <w:r>
+        <w:rPr>
+          <w:b/>
+          <w:bCs/>
+          <w:lang w:val="en-GB"/>
+        </w:rPr>
+        <w:t>-</w:t>
+      </w:r>
+      <w:r>
+        <w:rPr>
+          <w:b/>
+          <w:bCs/>
+          <w:lang w:val="en-GB"/>
+        </w:rPr>
+        <w:t>R3</w:t>
+      </w:r>
+      <w:r>
+        <w:rPr>
+          <w:b/>
+          <w:bCs/>
+          <w:lang w:val="en-GB"/>
+        </w:rPr>
+        <w:t>ES</w:t>
       </w:r>
       <w:r>
         <w:t>.</w:t>
@@ -7259,7 +7283,19 @@
         <w:rPr>
           <w:lang w:val="fr-FR"/>
         </w:rPr>
-        <w:t>Modbus RTU v1.1v compliant</w:t>
+        <w:t>Modbus RTU v1.1</w:t>
+      </w:r>
+      <w:r>
+        <w:rPr>
+          <w:lang w:val="fr-FR"/>
+        </w:rPr>
+        <w:t>_r3</w:t>
+      </w:r>
+      <w:r>
+        <w:rPr>
+          <w:lang w:val="fr-FR"/>
+        </w:rPr>
+        <w:t xml:space="preserve"> compliant</w:t>
       </w:r>
     </w:p>
     <w:p>
@@ -7314,15 +7350,24 @@
       <w:pPr>
         <w:pStyle w:val="Compact"/>
         <w:numPr>
+          <w:ilvl w:val="1"/>
+          <w:numId w:val="3"/>
+        </w:numPr>
+      </w:pPr>
+      <w:r>
+        <w:t>Device identification 17</w:t>
+      </w:r>
+    </w:p>
+    <w:p>
+      <w:pPr>
+        <w:pStyle w:val="Compact"/>
+        <w:numPr>
           <w:ilvl w:val="0"/>
           <w:numId w:val="1"/>
         </w:numPr>
       </w:pPr>
       <w:r>
-        <w:t xml:space="preserve">Operational integrity </w:t>
-      </w:r>
-      <w:r>
-        <w:t>minded</w:t>
+        <w:t>Operational integrity</w:t>
       </w:r>
     </w:p>
     <w:p>
@@ -7980,31 +8025,45 @@
         <w:pStyle w:val="FirstParagraph"/>
       </w:pPr>
       <w:r>
-        <w:t xml:space="preserve">Filtering can be </w:t>
-      </w:r>
-      <w:r>
-        <w:t xml:space="preserve">configured </w:t>
-      </w:r>
-      <w:r>
-        <w:t xml:space="preserve">to control the minimum ON and OFF </w:t>
-      </w:r>
-      <w:r>
-        <w:t xml:space="preserve">relay </w:t>
-      </w:r>
-      <w:r>
-        <w:t xml:space="preserve">cycles duration. An ON filter of 2 </w:t>
-      </w:r>
-      <w:r>
-        <w:t>seconds</w:t>
-      </w:r>
-      <w:r>
-        <w:t xml:space="preserve"> means that the relay ON cycle will never be shorter </w:t>
-      </w:r>
-      <w:r>
-        <w:t>than</w:t>
-      </w:r>
-      <w:r>
-        <w:t xml:space="preserve"> 2 seconds. The same goes for the OFF filter, which guarantees a minimum duration of the OFF cycle. Any command received during a filtered cycle will be accepted and will become the next relay state once the cycle is complete and unless overwritten by another command.</w:t>
+        <w:t>Filtering can be configured to enforce minimum durations for the relay’s closed and open states.</w:t>
+      </w:r>
+    </w:p>
+    <w:p>
+      <w:pPr>
+        <w:pStyle w:val="FirstParagraph"/>
+      </w:pPr>
+      <w:r>
+        <w:t xml:space="preserve">The closed-state filter defines how long the relay </w:t>
+      </w:r>
+      <w:r>
+        <w:t xml:space="preserve">will </w:t>
+      </w:r>
+      <w:r>
+        <w:t>remain closed before it can change state.</w:t>
+      </w:r>
+    </w:p>
+    <w:p>
+      <w:pPr>
+        <w:pStyle w:val="FirstParagraph"/>
+      </w:pPr>
+      <w:r>
+        <w:t>For example, a closed-state filter of 2 seconds ensures the relay remains closed for at least 2 seconds.</w:t>
+      </w:r>
+    </w:p>
+    <w:p>
+      <w:pPr>
+        <w:pStyle w:val="FirstParagraph"/>
+      </w:pPr>
+      <w:r>
+        <w:t>The open-state filter works the same way, guaranteeing a minimum open time.</w:t>
+      </w:r>
+    </w:p>
+    <w:p>
+      <w:pPr>
+        <w:pStyle w:val="FirstParagraph"/>
+      </w:pPr>
+      <w:r>
+        <w:t>Any command received during a filtered period is queued and will take effect once the filter duration ends—unless a newer command overrides it.</w:t>
       </w:r>
     </w:p>
     <w:p>
@@ -8016,194 +8075,118 @@
           <w:b/>
           <w:bCs/>
         </w:rPr>
+        <w:lastRenderedPageBreak/>
         <w:t>Example</w:t>
       </w:r>
       <w:r>
-        <w:t xml:space="preserve">: a relay has an ON minimum cycle time of </w:t>
-      </w:r>
-      <w:r>
-        <w:t>4</w:t>
-      </w:r>
-      <w:r>
-        <w:rPr>
-          <w:u w:val="single"/>
-        </w:rPr>
-        <w:t xml:space="preserve"> seconds</w:t>
-      </w:r>
-      <w:r>
-        <w:t xml:space="preserve"> and </w:t>
-      </w:r>
-      <w:r>
-        <w:rPr>
-          <w:u w:val="single"/>
-        </w:rPr>
-        <w:t>no</w:t>
-      </w:r>
-      <w:r>
-        <w:t xml:space="preserve"> filter for the OFF.</w:t>
-      </w:r>
-    </w:p>
-    <w:p>
-      <w:pPr>
-        <w:pStyle w:val="Compact"/>
+        <w:t xml:space="preserve">: </w:t>
+      </w:r>
+      <w:r>
+        <w:br/>
+      </w:r>
+      <w:r>
+        <w:t>A relay has a minimum closed-cycle time of 4 seconds and no filter on the open state.</w:t>
+      </w:r>
+    </w:p>
+    <w:p>
+      <w:pPr>
+        <w:pStyle w:val="BodyText"/>
         <w:numPr>
           <w:ilvl w:val="0"/>
-          <w:numId w:val="10"/>
+          <w:numId w:val="37"/>
         </w:numPr>
       </w:pPr>
       <w:r>
-        <w:t xml:space="preserve">It receives </w:t>
-      </w:r>
-      <w:r>
-        <w:t>an ON</w:t>
-      </w:r>
-      <w:r>
-        <w:t xml:space="preserve"> command. It turns ON. The cycle starts.</w:t>
-      </w:r>
-    </w:p>
-    <w:p>
-      <w:pPr>
-        <w:pStyle w:val="Compact"/>
+        <w:t xml:space="preserve">The relay receives a close command → it </w:t>
+      </w:r>
+      <w:proofErr w:type="gramStart"/>
+      <w:r>
+        <w:t>closes</w:t>
+      </w:r>
+      <w:proofErr w:type="gramEnd"/>
+      <w:r>
+        <w:t xml:space="preserve"> and the closed-cycle timer starts.</w:t>
+      </w:r>
+    </w:p>
+    <w:p>
+      <w:pPr>
+        <w:pStyle w:val="BodyText"/>
         <w:numPr>
           <w:ilvl w:val="0"/>
-          <w:numId w:val="10"/>
+          <w:numId w:val="37"/>
         </w:numPr>
       </w:pPr>
       <w:r>
-        <w:t xml:space="preserve">Within 1 second, an OFF command is sent. This command </w:t>
-      </w:r>
-      <w:r>
-        <w:t>becomes</w:t>
-      </w:r>
-      <w:r>
-        <w:t xml:space="preserve"> the next relay state, but the state of the relay </w:t>
-      </w:r>
-      <w:r>
-        <w:t>stays</w:t>
-      </w:r>
-      <w:r>
-        <w:t xml:space="preserve"> unchanged.</w:t>
-      </w:r>
-    </w:p>
-    <w:p>
-      <w:pPr>
-        <w:pStyle w:val="Compact"/>
+        <w:t>After 1 second, an open command is received. This command is stored as the next state, but the relay remains closed until the minimum 4-second period is complete.</w:t>
+      </w:r>
+    </w:p>
+    <w:p>
+      <w:pPr>
+        <w:pStyle w:val="BodyText"/>
         <w:numPr>
           <w:ilvl w:val="0"/>
-          <w:numId w:val="10"/>
+          <w:numId w:val="37"/>
         </w:numPr>
       </w:pPr>
       <w:r>
-        <w:t xml:space="preserve">After </w:t>
-      </w:r>
-      <w:r>
-        <w:t>a further 3</w:t>
-      </w:r>
-      <w:r>
-        <w:t xml:space="preserve"> seconds, the relay turns </w:t>
-      </w:r>
-      <w:r>
-        <w:t>OFF</w:t>
-      </w:r>
-      <w:r>
-        <w:t xml:space="preserve"> since the cycle is completed</w:t>
-      </w:r>
-    </w:p>
-    <w:p>
-      <w:pPr>
-        <w:pStyle w:val="Compact"/>
+        <w:t xml:space="preserve">After 3 more seconds (4 total), the relay opens because the </w:t>
+      </w:r>
+      <w:proofErr w:type="gramStart"/>
+      <w:r>
+        <w:t>closed-cycle</w:t>
+      </w:r>
+      <w:proofErr w:type="gramEnd"/>
+      <w:r>
+        <w:t xml:space="preserve"> has ended.</w:t>
+      </w:r>
+    </w:p>
+    <w:p>
+      <w:pPr>
+        <w:pStyle w:val="BodyText"/>
         <w:numPr>
           <w:ilvl w:val="0"/>
-          <w:numId w:val="10"/>
+          <w:numId w:val="37"/>
         </w:numPr>
       </w:pPr>
       <w:r>
-        <w:lastRenderedPageBreak/>
-        <w:t xml:space="preserve">A new ON is </w:t>
-      </w:r>
-      <w:r>
-        <w:t>sent;</w:t>
-      </w:r>
-      <w:r>
-        <w:t xml:space="preserve"> the relay </w:t>
-      </w:r>
-      <w:r>
-        <w:t>turns</w:t>
-      </w:r>
-      <w:r>
-        <w:t xml:space="preserve"> ON right away since the OFF cycle is not filtered.</w:t>
-      </w:r>
-    </w:p>
-    <w:p>
-      <w:pPr>
-        <w:pStyle w:val="Compact"/>
+        <w:t>A new close command is received → the relay closes immediately, since the open state has no filter.</w:t>
+      </w:r>
+    </w:p>
+    <w:p>
+      <w:pPr>
+        <w:pStyle w:val="BodyText"/>
         <w:numPr>
           <w:ilvl w:val="0"/>
-          <w:numId w:val="10"/>
+          <w:numId w:val="37"/>
         </w:numPr>
       </w:pPr>
       <w:r>
-        <w:t xml:space="preserve">Within </w:t>
-      </w:r>
-      <w:r>
-        <w:t>2</w:t>
-      </w:r>
-      <w:r>
-        <w:t xml:space="preserve"> second</w:t>
-      </w:r>
-      <w:r>
-        <w:t>s</w:t>
-      </w:r>
-      <w:r>
-        <w:t>, an OFF is sent. The relay stays on.</w:t>
-      </w:r>
-    </w:p>
-    <w:p>
-      <w:pPr>
-        <w:pStyle w:val="Compact"/>
+        <w:t>After 2 seconds, another open command arrives. The relay stays closed because the 4-second minimum closed-cycle has not elapsed.</w:t>
+      </w:r>
+    </w:p>
+    <w:p>
+      <w:pPr>
+        <w:pStyle w:val="BodyText"/>
         <w:numPr>
           <w:ilvl w:val="0"/>
-          <w:numId w:val="10"/>
+          <w:numId w:val="37"/>
         </w:numPr>
       </w:pPr>
       <w:r>
-        <w:t>Another 1 second later, an ON is sent. The relay is already ON. The next state is the current state, so nothing happens.</w:t>
-      </w:r>
-    </w:p>
-    <w:p>
-      <w:pPr>
-        <w:pStyle w:val="Compact"/>
+        <w:t>One second later (3 seconds into the cycle), another close command arrives. The relay is already closed, so nothing changes.</w:t>
+      </w:r>
+    </w:p>
+    <w:p>
+      <w:pPr>
+        <w:pStyle w:val="BodyText"/>
         <w:numPr>
           <w:ilvl w:val="0"/>
-          <w:numId w:val="10"/>
+          <w:numId w:val="37"/>
         </w:numPr>
       </w:pPr>
       <w:r>
-        <w:t xml:space="preserve">Another </w:t>
-      </w:r>
-      <w:r>
-        <w:t>2</w:t>
-      </w:r>
-      <w:r>
-        <w:t xml:space="preserve"> seconds later, an OFF is sent. The relay turns OFF </w:t>
-      </w:r>
-      <w:r>
-        <w:t>immediately</w:t>
-      </w:r>
-      <w:r>
-        <w:t xml:space="preserve">, because the ON cycle is now </w:t>
-      </w:r>
-      <w:r>
-        <w:t>more than 4</w:t>
-      </w:r>
-      <w:r>
-        <w:t xml:space="preserve"> seconds, the ON cycle filter duration.</w:t>
-      </w:r>
-    </w:p>
-    <w:p>
-      <w:pPr>
-        <w:pStyle w:val="Compact"/>
-      </w:pPr>
+        <w:t>Two seconds later (5 seconds total in the closed state), an open command is received. The relay opens immediately, since the closed cycle has exceeded the 4-second filter duration.</w:t>
+      </w:r>
     </w:p>
     <w:p>
       <w:pPr>
@@ -8324,7 +8307,7 @@
         <w:pStyle w:val="Compact"/>
         <w:numPr>
           <w:ilvl w:val="0"/>
-          <w:numId w:val="11"/>
+          <w:numId w:val="36"/>
         </w:numPr>
       </w:pPr>
       <w:r>
@@ -8336,7 +8319,7 @@
         <w:pStyle w:val="Compact"/>
         <w:numPr>
           <w:ilvl w:val="0"/>
-          <w:numId w:val="11"/>
+          <w:numId w:val="36"/>
         </w:numPr>
       </w:pPr>
       <w:r>
@@ -8348,7 +8331,7 @@
         <w:pStyle w:val="Compact"/>
         <w:numPr>
           <w:ilvl w:val="0"/>
-          <w:numId w:val="11"/>
+          <w:numId w:val="36"/>
         </w:numPr>
       </w:pPr>
       <w:r>
@@ -8375,7 +8358,7 @@
         <w:pStyle w:val="Compact"/>
         <w:numPr>
           <w:ilvl w:val="0"/>
-          <w:numId w:val="11"/>
+          <w:numId w:val="36"/>
         </w:numPr>
       </w:pPr>
       <w:r>
@@ -8406,7 +8389,7 @@
         <w:pStyle w:val="Compact"/>
         <w:numPr>
           <w:ilvl w:val="0"/>
-          <w:numId w:val="12"/>
+          <w:numId w:val="35"/>
         </w:numPr>
       </w:pPr>
       <w:r>
@@ -8421,7 +8404,7 @@
         <w:pStyle w:val="Compact"/>
         <w:numPr>
           <w:ilvl w:val="0"/>
-          <w:numId w:val="12"/>
+          <w:numId w:val="35"/>
         </w:numPr>
       </w:pPr>
       <w:r>
@@ -8436,7 +8419,7 @@
         <w:pStyle w:val="Compact"/>
         <w:numPr>
           <w:ilvl w:val="0"/>
-          <w:numId w:val="12"/>
+          <w:numId w:val="35"/>
         </w:numPr>
       </w:pPr>
       <w:r>
@@ -8457,7 +8440,7 @@
         <w:pStyle w:val="Compact"/>
         <w:numPr>
           <w:ilvl w:val="0"/>
-          <w:numId w:val="12"/>
+          <w:numId w:val="35"/>
         </w:numPr>
       </w:pPr>
       <w:r>
@@ -8484,7 +8467,7 @@
         <w:pStyle w:val="Compact"/>
         <w:numPr>
           <w:ilvl w:val="0"/>
-          <w:numId w:val="12"/>
+          <w:numId w:val="35"/>
         </w:numPr>
       </w:pPr>
       <w:r>
@@ -8505,7 +8488,7 @@
         <w:pStyle w:val="Compact"/>
         <w:numPr>
           <w:ilvl w:val="0"/>
-          <w:numId w:val="12"/>
+          <w:numId w:val="35"/>
         </w:numPr>
       </w:pPr>
       <w:r>
@@ -9126,11 +9109,21 @@
           <w:b/>
           <w:bCs/>
         </w:rPr>
-        <w:t>Slave ID :</w:t>
-      </w:r>
+        <w:t xml:space="preserve">Slave </w:t>
+      </w:r>
+      <w:proofErr w:type="gramStart"/>
+      <w:r>
+        <w:rPr>
+          <w:b/>
+          <w:bCs/>
+        </w:rPr>
+        <w:t>ID :</w:t>
+      </w:r>
+      <w:proofErr w:type="gramEnd"/>
       <w:r>
         <w:t xml:space="preserve"> </w:t>
       </w:r>
+      <w:proofErr w:type="gramStart"/>
       <w:r>
         <w:rPr>
           <w:rStyle w:val="VerbatimChar"/>
@@ -9138,7 +9131,11 @@
         <w:t>248</w:t>
       </w:r>
       <w:r>
-        <w:t xml:space="preserve"> ; This value is reserved in the Modbus standard, so no other devices should use it</w:t>
+        <w:t xml:space="preserve"> ;</w:t>
+      </w:r>
+      <w:proofErr w:type="gramEnd"/>
+      <w:r>
+        <w:t xml:space="preserve"> This value is reserved in the Modbus standard, so no other devices should use it</w:t>
       </w:r>
       <w:r>
         <w:t>.</w:t>
@@ -9219,7 +9216,24 @@
         <w:pStyle w:val="FirstParagraph"/>
       </w:pPr>
       <w:r>
-        <w:t>You may use any Modbus master application to reconfigure the device, or use the RelayGuardian application using the following procedure</w:t>
+        <w:t xml:space="preserve">You may use any Modbus master application to reconfigure the device, or use the </w:t>
+      </w:r>
+      <w:proofErr w:type="spellStart"/>
+      <w:r>
+        <w:t>RTU</w:t>
+      </w:r>
+      <w:r>
+        <w:t>Guardian</w:t>
+      </w:r>
+      <w:proofErr w:type="spellEnd"/>
+      <w:r>
+        <w:rPr>
+          <w:rStyle w:val="FootnoteReference"/>
+        </w:rPr>
+        <w:footnoteReference w:id="1"/>
+      </w:r>
+      <w:r>
+        <w:t xml:space="preserve"> application using the following procedure</w:t>
       </w:r>
       <w:r>
         <w:t>:</w:t>
@@ -9234,7 +9248,21 @@
         </w:numPr>
       </w:pPr>
       <w:r>
-        <w:t xml:space="preserve">Start the RelayGuardian </w:t>
+        <w:t xml:space="preserve">Start the </w:t>
+      </w:r>
+      <w:proofErr w:type="spellStart"/>
+      <w:r>
+        <w:t>R</w:t>
+      </w:r>
+      <w:r>
+        <w:t>TU</w:t>
+      </w:r>
+      <w:r>
+        <w:t>Guardian</w:t>
+      </w:r>
+      <w:proofErr w:type="spellEnd"/>
+      <w:r>
+        <w:t xml:space="preserve"> </w:t>
       </w:r>
       <w:r>
         <w:t>application.</w:t>
@@ -9285,7 +9313,24 @@
         </w:numPr>
       </w:pPr>
       <w:r>
-        <w:t>Issue a scan command in the RelayGuardian to make sure the RS485 adapter sends the data</w:t>
+        <w:t xml:space="preserve">Issue a scan command in the </w:t>
+      </w:r>
+      <w:proofErr w:type="spellStart"/>
+      <w:r>
+        <w:t>R</w:t>
+      </w:r>
+      <w:r>
+        <w:t>TU</w:t>
+      </w:r>
+      <w:r>
+        <w:t>Guardian</w:t>
+      </w:r>
+      <w:proofErr w:type="spellEnd"/>
+      <w:r>
+        <w:t xml:space="preserve"> </w:t>
+      </w:r>
+      <w:r>
+        <w:t>to make sure the RS485 adapter sends the data</w:t>
       </w:r>
       <w:r>
         <w:t>. The device Modbus LEDs should blink</w:t>
@@ -9363,16 +9408,30 @@
         <w:br/>
       </w:r>
       <w:r>
-        <w:t>In the '</w:t>
-      </w:r>
-      <w:r>
-        <w:t>RelayGuardian</w:t>
-      </w:r>
-      <w:r>
-        <w:t xml:space="preserve">' application, click the 'Recovery' </w:t>
-      </w:r>
-      <w:r>
-        <w:t>button.</w:t>
+        <w:t xml:space="preserve">In the </w:t>
+      </w:r>
+      <w:proofErr w:type="spellStart"/>
+      <w:r>
+        <w:t>R</w:t>
+      </w:r>
+      <w:r>
+        <w:t>TU</w:t>
+      </w:r>
+      <w:r>
+        <w:t>Guardian</w:t>
+      </w:r>
+      <w:proofErr w:type="spellEnd"/>
+      <w:r>
+        <w:t xml:space="preserve"> </w:t>
+      </w:r>
+      <w:r>
+        <w:t xml:space="preserve">application, </w:t>
+      </w:r>
+      <w:r>
+        <w:t>press ‘CTRL+R’ to activate the recovery</w:t>
+      </w:r>
+      <w:r>
+        <w:t>.</w:t>
       </w:r>
     </w:p>
     <w:p>
@@ -9384,22 +9443,18 @@
         </w:numPr>
       </w:pPr>
       <w:r>
-        <w:t xml:space="preserve">Confirm proper </w:t>
-      </w:r>
-      <w:r>
-        <w:t>connection.</w:t>
-      </w:r>
-    </w:p>
-    <w:p>
-      <w:pPr>
-        <w:pStyle w:val="Compact"/>
-        <w:numPr>
-          <w:ilvl w:val="0"/>
-          <w:numId w:val="22"/>
-        </w:numPr>
-      </w:pPr>
-      <w:r>
-        <w:t xml:space="preserve">In the 'RelayGuardian', click the 'Locate' button. All LEDs of relay module should be flashing </w:t>
+        <w:t xml:space="preserve">The </w:t>
+      </w:r>
+      <w:proofErr w:type="spellStart"/>
+      <w:r>
+        <w:t>modbus</w:t>
+      </w:r>
+      <w:proofErr w:type="spellEnd"/>
+      <w:r>
+        <w:t xml:space="preserve"> </w:t>
+      </w:r>
+      <w:r>
+        <w:t xml:space="preserve">LEDs of relay module should be flashing </w:t>
       </w:r>
       <w:r>
         <w:t>fast!</w:t>
@@ -9412,21 +9467,6 @@
       </w:r>
       <w:r>
         <w:t>.</w:t>
-      </w:r>
-    </w:p>
-    <w:p>
-      <w:pPr>
-        <w:pStyle w:val="Compact"/>
-        <w:numPr>
-          <w:ilvl w:val="0"/>
-          <w:numId w:val="22"/>
-        </w:numPr>
-      </w:pPr>
-      <w:r>
-        <w:t xml:space="preserve">Stop the device location </w:t>
-      </w:r>
-      <w:r>
-        <w:t>mode.</w:t>
       </w:r>
     </w:p>
     <w:p>
@@ -10544,6 +10584,7 @@
       <w:r>
         <w:t xml:space="preserve">To help locate a relays device, a Modbus </w:t>
       </w:r>
+      <w:proofErr w:type="gramStart"/>
       <w:r>
         <w:rPr>
           <w:i/>
@@ -10551,6 +10592,7 @@
         </w:rPr>
         <w:t>locate</w:t>
       </w:r>
+      <w:proofErr w:type="gramEnd"/>
       <w:r>
         <w:t xml:space="preserve"> command can be sent. See </w:t>
       </w:r>
@@ -10571,7 +10613,15 @@
         <w:pStyle w:val="BodyText"/>
       </w:pPr>
       <w:r>
-        <w:t>In locate mode, a sequence is repeated with all LEDs flashing fast (10Hz) for one second, and display their normal value for the next.</w:t>
+        <w:t xml:space="preserve">In locate mode, a sequence is repeated with all LEDs flashing fast (10Hz) for one </w:t>
+      </w:r>
+      <w:proofErr w:type="gramStart"/>
+      <w:r>
+        <w:t>second, and</w:t>
+      </w:r>
+      <w:proofErr w:type="gramEnd"/>
+      <w:r>
+        <w:t xml:space="preserve"> display their normal value for the next.</w:t>
       </w:r>
     </w:p>
     <w:p>
@@ -11073,8 +11123,13 @@
             <w:pPr>
               <w:pStyle w:val="Compact"/>
             </w:pPr>
-            <w:r>
-              <w:t>Flash . .</w:t>
+            <w:proofErr w:type="gramStart"/>
+            <w:r>
+              <w:t>Flash .</w:t>
+            </w:r>
+            <w:proofErr w:type="gramEnd"/>
+            <w:r>
+              <w:t xml:space="preserve"> .</w:t>
             </w:r>
           </w:p>
         </w:tc>
@@ -11447,7 +11502,15 @@
               <w:t>Along with the EStop</w:t>
             </w:r>
             <w:r>
-              <w:t xml:space="preserve"> LED, indicates a</w:t>
+              <w:t xml:space="preserve"> LED, </w:t>
+            </w:r>
+            <w:proofErr w:type="gramStart"/>
+            <w:r>
+              <w:t>indicates</w:t>
+            </w:r>
+            <w:proofErr w:type="gramEnd"/>
+            <w:r>
+              <w:t xml:space="preserve"> a</w:t>
             </w:r>
             <w:r>
               <w:t xml:space="preserve">n EStop </w:t>
@@ -11648,8 +11711,13 @@
               <w:t>Along with the EStop</w:t>
             </w:r>
             <w:r>
-              <w:t xml:space="preserve"> LED, indicates</w:t>
-            </w:r>
+              <w:t xml:space="preserve"> LED, </w:t>
+            </w:r>
+            <w:proofErr w:type="gramStart"/>
+            <w:r>
+              <w:t>indicates</w:t>
+            </w:r>
+            <w:proofErr w:type="gramEnd"/>
             <w:r>
               <w:t xml:space="preserve"> </w:t>
             </w:r>
@@ -11963,7 +12031,21 @@
         <w:rPr>
           <w:lang w:val="en-GB"/>
         </w:rPr>
-        <w:t>_&lt;model_name&gt;’.</w:t>
+        <w:t>_&lt;</w:t>
+      </w:r>
+      <w:proofErr w:type="spellStart"/>
+      <w:r>
+        <w:rPr>
+          <w:lang w:val="en-GB"/>
+        </w:rPr>
+        <w:t>model_name</w:t>
+      </w:r>
+      <w:proofErr w:type="spellEnd"/>
+      <w:r>
+        <w:rPr>
+          <w:lang w:val="en-GB"/>
+        </w:rPr>
+        <w:t>&gt;’.</w:t>
       </w:r>
     </w:p>
     <w:p>
@@ -12165,12 +12247,14 @@
                 <w:lang w:val="en-GB"/>
               </w:rPr>
             </w:pPr>
+            <w:proofErr w:type="spellStart"/>
             <w:r>
               <w:rPr>
                 <w:lang w:val="en-GB"/>
               </w:rPr>
               <w:t>VendorName</w:t>
             </w:r>
+            <w:proofErr w:type="spellEnd"/>
           </w:p>
         </w:tc>
         <w:tc>
@@ -12223,12 +12307,14 @@
                 <w:lang w:val="en-GB"/>
               </w:rPr>
             </w:pPr>
+            <w:proofErr w:type="spellStart"/>
             <w:r>
               <w:rPr>
                 <w:lang w:val="en-GB"/>
               </w:rPr>
               <w:t>ARex</w:t>
             </w:r>
+            <w:proofErr w:type="spellEnd"/>
           </w:p>
         </w:tc>
       </w:tr>
@@ -12263,12 +12349,14 @@
                 <w:lang w:val="en-GB"/>
               </w:rPr>
             </w:pPr>
+            <w:proofErr w:type="spellStart"/>
             <w:r>
               <w:rPr>
                 <w:lang w:val="en-GB"/>
               </w:rPr>
               <w:t>ProductCode</w:t>
             </w:r>
+            <w:proofErr w:type="spellEnd"/>
           </w:p>
         </w:tc>
         <w:tc>
@@ -12358,12 +12446,14 @@
                 <w:lang w:val="en-GB"/>
               </w:rPr>
             </w:pPr>
+            <w:proofErr w:type="spellStart"/>
             <w:r>
               <w:rPr>
                 <w:lang w:val="en-GB"/>
               </w:rPr>
               <w:t>MajorMinorRevision</w:t>
             </w:r>
+            <w:proofErr w:type="spellEnd"/>
           </w:p>
         </w:tc>
         <w:tc>
@@ -12450,12 +12540,14 @@
                 <w:lang w:val="en-GB"/>
               </w:rPr>
             </w:pPr>
+            <w:proofErr w:type="spellStart"/>
             <w:r>
               <w:rPr>
                 <w:lang w:val="en-GB"/>
               </w:rPr>
               <w:t>VendorUrl</w:t>
             </w:r>
+            <w:proofErr w:type="spellEnd"/>
           </w:p>
         </w:tc>
         <w:tc>
@@ -12551,12 +12643,14 @@
                 <w:lang w:val="en-GB"/>
               </w:rPr>
             </w:pPr>
+            <w:proofErr w:type="spellStart"/>
             <w:r>
               <w:rPr>
                 <w:lang w:val="en-GB"/>
               </w:rPr>
               <w:t>ModelName</w:t>
             </w:r>
+            <w:proofErr w:type="spellEnd"/>
           </w:p>
         </w:tc>
         <w:tc>
@@ -12747,11 +12841,16 @@
         <w:pStyle w:val="BodyText"/>
       </w:pPr>
       <w:r>
-        <w:t>The device supports the following function code</w:t>
+        <w:t xml:space="preserve">The device supports the following function </w:t>
+      </w:r>
+      <w:proofErr w:type="gramStart"/>
+      <w:r>
+        <w:t>code</w:t>
       </w:r>
       <w:r>
         <w:t>s</w:t>
       </w:r>
+      <w:proofErr w:type="gramEnd"/>
       <w:r>
         <w:t>:</w:t>
       </w:r>
@@ -12819,7 +12918,15 @@
         </w:r>
       </w:hyperlink>
       <w:r>
-        <w:t xml:space="preserve"> Write a single output to either On (1) or Off</w:t>
+        <w:t xml:space="preserve"> Write a single output to either </w:t>
+      </w:r>
+      <w:proofErr w:type="gramStart"/>
+      <w:r>
+        <w:t>On</w:t>
+      </w:r>
+      <w:proofErr w:type="gramEnd"/>
+      <w:r>
+        <w:t xml:space="preserve"> (1) or Off</w:t>
       </w:r>
     </w:p>
     <w:p>
@@ -12889,6 +12996,7 @@
         </w:rPr>
         <w:t xml:space="preserve">⚠️ WARNING:  Attempts to write individually a disabled relay with the function 05 will generate a </w:t>
       </w:r>
+      <w:proofErr w:type="spellStart"/>
       <w:r>
         <w:rPr>
           <w:rFonts w:ascii="Consolas" w:hAnsi="Consolas"/>
@@ -12929,6 +13037,7 @@
         </w:rPr>
         <w:t>failure</w:t>
       </w:r>
+      <w:proofErr w:type="spellEnd"/>
       <w:r>
         <w:rPr>
           <w:b/>
@@ -13222,6 +13331,38 @@
         <w:t>Status &amp; Monitoring</w:t>
       </w:r>
       <w:bookmarkEnd w:id="65"/>
+    </w:p>
+    <w:p>
+      <w:pPr>
+        <w:pStyle w:val="BodyText"/>
+      </w:pPr>
+      <w:r>
+        <w:t xml:space="preserve">Use </w:t>
+      </w:r>
+      <w:r>
+        <w:t xml:space="preserve">function </w:t>
+      </w:r>
+      <w:r>
+        <w:rPr>
+          <w:b/>
+          <w:bCs/>
+        </w:rPr>
+        <w:t>04</w:t>
+      </w:r>
+      <w:r>
+        <w:t xml:space="preserve">: </w:t>
+      </w:r>
+      <w:hyperlink r:id="rId19" w:anchor="function04">
+        <w:r>
+          <w:rPr>
+            <w:rStyle w:val="Hyperlink"/>
+          </w:rPr>
+          <w:t>Read input registers</w:t>
+        </w:r>
+      </w:hyperlink>
+      <w:r>
+        <w:t xml:space="preserve"> is supported to read registers.</w:t>
+      </w:r>
     </w:p>
     <w:tbl>
       <w:tblPr>
@@ -13588,7 +13729,18 @@
               <w:br/>
             </w:r>
             <w:r>
-              <w:t>1: DC2: AC</w:t>
+              <w:t>1: DC</w:t>
+            </w:r>
+            <w:r>
+              <w:tab/>
+            </w:r>
+          </w:p>
+          <w:p>
+            <w:pPr>
+              <w:pStyle w:val="Compact"/>
+            </w:pPr>
+            <w:r>
+              <w:t>2: AC</w:t>
             </w:r>
           </w:p>
         </w:tc>
@@ -13660,7 +13812,21 @@
               <w:pStyle w:val="Compact"/>
             </w:pPr>
             <w:r>
-              <w:t>1/10 volts0-3000</w:t>
+              <w:t xml:space="preserve">1/10 </w:t>
+            </w:r>
+            <w:proofErr w:type="gramStart"/>
+            <w:r>
+              <w:t>volts</w:t>
+            </w:r>
+            <w:r>
+              <w:t xml:space="preserve"> :</w:t>
+            </w:r>
+            <w:proofErr w:type="gramEnd"/>
+            <w:r>
+              <w:t xml:space="preserve"> </w:t>
+            </w:r>
+            <w:r>
+              <w:t>0-3000</w:t>
             </w:r>
           </w:p>
         </w:tc>
@@ -13721,7 +13887,13 @@
               <w:cnfStyle w:val="000000100000" w:firstRow="0" w:lastRow="0" w:firstColumn="0" w:lastColumn="0" w:oddVBand="0" w:evenVBand="0" w:oddHBand="1" w:evenHBand="0" w:firstRowFirstColumn="0" w:firstRowLastColumn="0" w:lastRowFirstColumn="0" w:lastRowLastColumn="0"/>
             </w:pPr>
             <w:r>
-              <w:t>Infeed highest voltage</w:t>
+              <w:t xml:space="preserve">Infeed </w:t>
+            </w:r>
+            <w:r>
+              <w:t>lowest</w:t>
+            </w:r>
+            <w:r>
+              <w:t xml:space="preserve"> voltage</w:t>
             </w:r>
           </w:p>
         </w:tc>
@@ -13812,7 +13984,13 @@
               <w:cnfStyle w:val="000000000000" w:firstRow="0" w:lastRow="0" w:firstColumn="0" w:lastColumn="0" w:oddVBand="0" w:evenVBand="0" w:oddHBand="0" w:evenHBand="0" w:firstRowFirstColumn="0" w:firstRowLastColumn="0" w:lastRowFirstColumn="0" w:lastRowLastColumn="0"/>
             </w:pPr>
             <w:r>
-              <w:t>Infeed lowest voltage</w:t>
+              <w:t xml:space="preserve">Infeed </w:t>
+            </w:r>
+            <w:r>
+              <w:t>highest</w:t>
+            </w:r>
+            <w:r>
+              <w:t xml:space="preserve"> voltage</w:t>
             </w:r>
           </w:p>
         </w:tc>
@@ -13826,7 +14004,10 @@
               <w:pStyle w:val="Compact"/>
             </w:pPr>
             <w:r>
-              <w:t>Same as 30014, but returns the lowest</w:t>
+              <w:t xml:space="preserve">Same as 30014, but returns the </w:t>
+            </w:r>
+            <w:r>
+              <w:t>highest</w:t>
             </w:r>
           </w:p>
         </w:tc>
@@ -14109,7 +14290,10 @@
               <w:pStyle w:val="Compact"/>
             </w:pPr>
             <w:r>
-              <w:t>30016</w:t>
+              <w:t>3001</w:t>
+            </w:r>
+            <w:r>
+              <w:t>7</w:t>
             </w:r>
           </w:p>
         </w:tc>
@@ -14124,7 +14308,10 @@
               <w:cnfStyle w:val="000000000000" w:firstRow="0" w:lastRow="0" w:firstColumn="0" w:lastColumn="0" w:oddVBand="0" w:evenVBand="0" w:oddHBand="0" w:evenHBand="0" w:firstRowFirstColumn="0" w:firstRowLastColumn="0" w:lastRowFirstColumn="0" w:lastRowLastColumn="0"/>
             </w:pPr>
             <w:r>
-              <w:t>0x000F</w:t>
+              <w:t>0x00</w:t>
+            </w:r>
+            <w:r>
+              <w:t>10</w:t>
             </w:r>
           </w:p>
         </w:tc>
@@ -14219,8 +14406,13 @@
               <w:t xml:space="preserve">Unexpected </w:t>
             </w:r>
             <w:r>
-              <w:t>Infeed voltage type</w:t>
-            </w:r>
+              <w:t xml:space="preserve">Infeed voltage </w:t>
+            </w:r>
+            <w:proofErr w:type="gramStart"/>
+            <w:r>
+              <w:t>type</w:t>
+            </w:r>
+            <w:proofErr w:type="gramEnd"/>
             <w:r>
               <w:br/>
             </w:r>
@@ -14234,7 +14426,15 @@
               <w:t>ncorrect voltage type was detected</w:t>
             </w:r>
             <w:r>
-              <w:t>. AC in vs DC expected for example.</w:t>
+              <w:t xml:space="preserve">. </w:t>
+            </w:r>
+            <w:proofErr w:type="gramStart"/>
+            <w:r>
+              <w:t>AC in</w:t>
+            </w:r>
+            <w:proofErr w:type="gramEnd"/>
+            <w:r>
+              <w:t xml:space="preserve"> vs DC expected for example.</w:t>
             </w:r>
           </w:p>
           <w:p>
@@ -14243,6 +14443,7 @@
               <w:ind w:left="796" w:hanging="567"/>
             </w:pPr>
             <w:r>
+              <w:lastRenderedPageBreak/>
               <w:t xml:space="preserve">Bit 4: </w:t>
             </w:r>
             <w:r>
@@ -14270,7 +14471,6 @@
               <w:br/>
             </w:r>
             <w:r>
-              <w:lastRenderedPageBreak/>
               <w:t>The voltage has gone over the configured threshold</w:t>
             </w:r>
           </w:p>
@@ -14410,7 +14610,10 @@
               <w:cnfStyle w:val="000000100000" w:firstRow="0" w:lastRow="0" w:firstColumn="0" w:lastColumn="0" w:oddVBand="0" w:evenVBand="0" w:oddHBand="1" w:evenHBand="0" w:firstRowFirstColumn="0" w:firstRowLastColumn="0" w:lastRowFirstColumn="0" w:lastRowLastColumn="0"/>
             </w:pPr>
             <w:r>
-              <w:t>0x0010</w:t>
+              <w:t>0x001</w:t>
+            </w:r>
+            <w:r>
+              <w:t>1</w:t>
             </w:r>
           </w:p>
         </w:tc>
@@ -14509,7 +14712,13 @@
               <w:cnfStyle w:val="000000000000" w:firstRow="0" w:lastRow="0" w:firstColumn="0" w:lastColumn="0" w:oddVBand="0" w:evenVBand="0" w:oddHBand="0" w:evenHBand="0" w:firstRowFirstColumn="0" w:firstRowLastColumn="0" w:lastRowFirstColumn="0" w:lastRowLastColumn="0"/>
             </w:pPr>
             <w:r>
-              <w:t>0x0011–0x0017</w:t>
+              <w:t>0x001</w:t>
+            </w:r>
+            <w:r>
+              <w:t>2</w:t>
+            </w:r>
+            <w:r>
+              <w:t>–0x0017</w:t>
             </w:r>
           </w:p>
         </w:tc>
@@ -14632,6 +14841,38 @@
       </w:r>
       <w:r>
         <w:t xml:space="preserve"> relays for other variants of devices.</w:t>
+      </w:r>
+    </w:p>
+    <w:p>
+      <w:pPr>
+        <w:pStyle w:val="BodyText"/>
+      </w:pPr>
+      <w:r>
+        <w:t xml:space="preserve">Use </w:t>
+      </w:r>
+      <w:r>
+        <w:t xml:space="preserve">function </w:t>
+      </w:r>
+      <w:r>
+        <w:rPr>
+          <w:b/>
+          <w:bCs/>
+        </w:rPr>
+        <w:t>04</w:t>
+      </w:r>
+      <w:r>
+        <w:t xml:space="preserve">: </w:t>
+      </w:r>
+      <w:hyperlink r:id="rId20" w:anchor="function04">
+        <w:r>
+          <w:rPr>
+            <w:rStyle w:val="Hyperlink"/>
+          </w:rPr>
+          <w:t>Read input registers</w:t>
+        </w:r>
+      </w:hyperlink>
+      <w:r>
+        <w:t xml:space="preserve"> is supported to read registers.</w:t>
       </w:r>
     </w:p>
     <w:tbl>
@@ -15468,7 +15709,7 @@
       <w:r>
         <w:t xml:space="preserve"> - </w:t>
       </w:r>
-      <w:hyperlink r:id="rId19" w:anchor="function03">
+      <w:hyperlink r:id="rId21" w:anchor="function03">
         <w:r>
           <w:rPr>
             <w:rStyle w:val="Hyperlink"/>
@@ -15498,7 +15739,7 @@
       <w:r>
         <w:t xml:space="preserve"> - </w:t>
       </w:r>
-      <w:hyperlink r:id="rId20" w:anchor="function06">
+      <w:hyperlink r:id="rId22" w:anchor="function06">
         <w:r>
           <w:rPr>
             <w:rStyle w:val="Hyperlink"/>
@@ -15528,7 +15769,7 @@
       <w:r>
         <w:t xml:space="preserve"> - </w:t>
       </w:r>
-      <w:hyperlink r:id="rId21" w:anchor="function16">
+      <w:hyperlink r:id="rId23" w:anchor="function16">
         <w:r>
           <w:rPr>
             <w:rStyle w:val="Hyperlink"/>
@@ -15722,6 +15963,94 @@
           <w:color w:val="0070C0"/>
         </w:rPr>
         <w:t xml:space="preserve"> registers 40001 to 40004 at once. Once a write is done, the device comes out of recovery mode and applies the changes right away.</w:t>
+      </w:r>
+    </w:p>
+    <w:p>
+      <w:pPr>
+        <w:pStyle w:val="BodyText"/>
+      </w:pPr>
+      <w:r>
+        <w:t xml:space="preserve">Use </w:t>
+      </w:r>
+      <w:r>
+        <w:t xml:space="preserve">function </w:t>
+      </w:r>
+      <w:r>
+        <w:rPr>
+          <w:b/>
+          <w:bCs/>
+        </w:rPr>
+        <w:t>16</w:t>
+      </w:r>
+      <w:r>
+        <w:t xml:space="preserve">: </w:t>
+      </w:r>
+      <w:hyperlink r:id="rId24" w:anchor="function04">
+        <w:r>
+          <w:t xml:space="preserve"> </w:t>
+        </w:r>
+        <w:r>
+          <w:rPr>
+            <w:rStyle w:val="Hyperlink"/>
+          </w:rPr>
+          <w:t>Write Multiple Registers</w:t>
+        </w:r>
+        <w:r>
+          <w:rPr>
+            <w:rStyle w:val="Hyperlink"/>
+          </w:rPr>
+          <w:t xml:space="preserve"> </w:t>
+        </w:r>
+      </w:hyperlink>
+      <w:r>
+        <w:t xml:space="preserve"> is supported to read registers.</w:t>
+      </w:r>
+    </w:p>
+    <w:p>
+      <w:pPr>
+        <w:pStyle w:val="BodyText"/>
+      </w:pPr>
+      <w:r>
+        <w:t xml:space="preserve">Use </w:t>
+      </w:r>
+      <w:r>
+        <w:t xml:space="preserve">function </w:t>
+      </w:r>
+      <w:r>
+        <w:rPr>
+          <w:b/>
+          <w:bCs/>
+        </w:rPr>
+        <w:t>03</w:t>
+      </w:r>
+      <w:r>
+        <w:t xml:space="preserve"> - </w:t>
+      </w:r>
+      <w:hyperlink r:id="rId25" w:anchor="function03">
+        <w:r>
+          <w:rPr>
+            <w:rStyle w:val="Hyperlink"/>
+          </w:rPr>
+          <w:t>Read Holding Registers</w:t>
+        </w:r>
+      </w:hyperlink>
+      <w:r>
+        <w:t xml:space="preserve"> </w:t>
+      </w:r>
+      <w:r>
+        <w:t xml:space="preserve">to </w:t>
+      </w:r>
+      <w:r>
+        <w:t>read</w:t>
+      </w:r>
+      <w:r>
+        <w:t xml:space="preserve"> </w:t>
+      </w:r>
+      <w:r>
+        <w:t xml:space="preserve">these </w:t>
+      </w:r>
+      <w:r>
+        <w:t>registers.</w:t>
       </w:r>
     </w:p>
     <w:tbl>
@@ -16344,13 +16673,29 @@
       </w:tr>
     </w:tbl>
     <w:p>
-      <w:pPr>
-        <w:pStyle w:val="Heading3"/>
-      </w:pPr>
       <w:bookmarkStart w:id="75" w:name="_Toc203926076"/>
       <w:bookmarkStart w:id="76" w:name="power-infeed-configuration"/>
       <w:bookmarkEnd w:id="74"/>
-      <w:r>
+    </w:p>
+    <w:p>
+      <w:pPr>
+        <w:rPr>
+          <w:rFonts w:asciiTheme="majorHAnsi" w:eastAsiaTheme="majorEastAsia" w:hAnsiTheme="majorHAnsi" w:cstheme="majorBidi"/>
+          <w:b/>
+          <w:bCs/>
+          <w:color w:val="000000" w:themeColor="text1"/>
+        </w:rPr>
+      </w:pPr>
+      <w:r>
+        <w:br w:type="page"/>
+      </w:r>
+    </w:p>
+    <w:p>
+      <w:pPr>
+        <w:pStyle w:val="Heading3"/>
+      </w:pPr>
+      <w:r>
+        <w:lastRenderedPageBreak/>
         <w:t>Power Infeed Configuration</w:t>
       </w:r>
       <w:bookmarkEnd w:id="75"/>
@@ -16363,28 +16708,154 @@
     <w:p>
       <w:pPr>
         <w:pStyle w:val="BlockText"/>
-      </w:pPr>
-      <w:r>
-        <w:rPr>
-          <w:rFonts w:ascii="Segoe UI Emoji" w:hAnsi="Segoe UI Emoji" w:cs="Segoe UI Emoji"/>
-          <w:b/>
-          <w:color w:val="FF0000"/>
-        </w:rPr>
-        <w:t>⚠️</w:t>
-      </w:r>
-      <w:r>
         <w:rPr>
           <w:b/>
           <w:color w:val="FF0000"/>
         </w:rPr>
-        <w:t xml:space="preserve"> WARNING:  Registers 40009 to 40011 must be written together using command</w:t>
-      </w:r>
+      </w:pPr>
       <w:r>
         <w:rPr>
           <w:b/>
-          <w:color w:val="FF0000"/>
+          <w:color w:val="0070C0"/>
         </w:rPr>
-        <w:t xml:space="preserve"> 16</w:t>
+        <w:t xml:space="preserve">📝 NOTE:  </w:t>
+      </w:r>
+      <w:r>
+        <w:rPr>
+          <w:b/>
+          <w:color w:val="0070C0"/>
+        </w:rPr>
+        <w:t xml:space="preserve">You must use </w:t>
+      </w:r>
+      <w:r>
+        <w:rPr>
+          <w:b/>
+          <w:color w:val="0070C0"/>
+        </w:rPr>
+        <w:t>function</w:t>
+      </w:r>
+      <w:r>
+        <w:rPr>
+          <w:b/>
+          <w:color w:val="0070C0"/>
+        </w:rPr>
+        <w:t xml:space="preserve"> 16 - Write Multiple Registers, writing registers 4000</w:t>
+      </w:r>
+      <w:r>
+        <w:rPr>
+          <w:b/>
+          <w:color w:val="0070C0"/>
+        </w:rPr>
+        <w:t>9</w:t>
+      </w:r>
+      <w:r>
+        <w:rPr>
+          <w:b/>
+          <w:color w:val="0070C0"/>
+        </w:rPr>
+        <w:t xml:space="preserve"> to 400</w:t>
+      </w:r>
+      <w:r>
+        <w:rPr>
+          <w:b/>
+          <w:color w:val="0070C0"/>
+        </w:rPr>
+        <w:t>11</w:t>
+      </w:r>
+      <w:r>
+        <w:rPr>
+          <w:b/>
+          <w:color w:val="0070C0"/>
+        </w:rPr>
+        <w:t xml:space="preserve"> at once.</w:t>
+      </w:r>
+    </w:p>
+    <w:p>
+      <w:pPr>
+        <w:pStyle w:val="BodyText"/>
+      </w:pPr>
+      <w:r>
+        <w:t xml:space="preserve">Use </w:t>
+      </w:r>
+      <w:r>
+        <w:t xml:space="preserve">function </w:t>
+      </w:r>
+      <w:r>
+        <w:rPr>
+          <w:b/>
+          <w:bCs/>
+        </w:rPr>
+        <w:t>16</w:t>
+      </w:r>
+      <w:r>
+        <w:t xml:space="preserve">: </w:t>
+      </w:r>
+      <w:hyperlink r:id="rId26" w:anchor="function04">
+        <w:r>
+          <w:t xml:space="preserve"> </w:t>
+        </w:r>
+        <w:r>
+          <w:rPr>
+            <w:rStyle w:val="Hyperlink"/>
+          </w:rPr>
+          <w:t>Write Multiple Registers</w:t>
+        </w:r>
+        <w:r>
+          <w:rPr>
+            <w:rStyle w:val="Hyperlink"/>
+          </w:rPr>
+          <w:t xml:space="preserve"> </w:t>
+        </w:r>
+      </w:hyperlink>
+      <w:r>
+        <w:t xml:space="preserve"> is supported to read registers.</w:t>
+      </w:r>
+    </w:p>
+    <w:p>
+      <w:pPr>
+        <w:pStyle w:val="BodyText"/>
+      </w:pPr>
+      <w:r>
+        <w:t xml:space="preserve">Use </w:t>
+      </w:r>
+      <w:r>
+        <w:t xml:space="preserve">function </w:t>
+      </w:r>
+      <w:r>
+        <w:rPr>
+          <w:b/>
+          <w:bCs/>
+        </w:rPr>
+        <w:t>03</w:t>
+      </w:r>
+      <w:r>
+        <w:t xml:space="preserve"> - </w:t>
+      </w:r>
+      <w:hyperlink r:id="rId27" w:anchor="function03">
+        <w:r>
+          <w:rPr>
+            <w:rStyle w:val="Hyperlink"/>
+          </w:rPr>
+          <w:t>Read Holding Registers</w:t>
+        </w:r>
+      </w:hyperlink>
+      <w:r>
+        <w:t xml:space="preserve"> </w:t>
+      </w:r>
+      <w:r>
+        <w:t xml:space="preserve">to </w:t>
+      </w:r>
+      <w:r>
+        <w:t>read</w:t>
+      </w:r>
+      <w:r>
+        <w:t xml:space="preserve"> </w:t>
+      </w:r>
+      <w:r>
+        <w:t xml:space="preserve">these </w:t>
+      </w:r>
+      <w:r>
+        <w:t>registers.</w:t>
       </w:r>
     </w:p>
     <w:tbl>
@@ -16574,13 +17045,19 @@
               <w:cnfStyle w:val="000000100000" w:firstRow="0" w:lastRow="0" w:firstColumn="0" w:lastColumn="0" w:oddVBand="0" w:evenVBand="0" w:oddHBand="1" w:evenHBand="0" w:firstRowFirstColumn="0" w:firstRowLastColumn="0" w:lastRowFirstColumn="0" w:lastRowLastColumn="0"/>
             </w:pPr>
             <w:r>
-              <w:t>0=DC</w:t>
+              <w:t>1</w:t>
+            </w:r>
+            <w:r>
+              <w:t>=DC</w:t>
             </w:r>
             <w:r>
               <w:br/>
             </w:r>
             <w:r>
-              <w:t>1=AC</w:t>
+              <w:t>2</w:t>
+            </w:r>
+            <w:r>
+              <w:t>=AC</w:t>
             </w:r>
           </w:p>
         </w:tc>
@@ -16856,7 +17333,6 @@
       <w:bookmarkStart w:id="78" w:name="safety-logic-configuration"/>
       <w:bookmarkEnd w:id="76"/>
       <w:r>
-        <w:lastRenderedPageBreak/>
         <w:t>Safety Logic Configuration</w:t>
       </w:r>
       <w:bookmarkEnd w:id="77"/>
@@ -16875,6 +17351,10 @@
     <w:p>
       <w:pPr>
         <w:pStyle w:val="BodyText"/>
+        <w:rPr>
+          <w:b/>
+          <w:color w:val="FF0000"/>
+        </w:rPr>
       </w:pPr>
       <w:r>
         <w:rPr>
@@ -16911,6 +17391,97 @@
           <w:color w:val="FF0000"/>
         </w:rPr>
         <w:t>16 is not supported</w:t>
+      </w:r>
+    </w:p>
+    <w:p>
+      <w:pPr>
+        <w:pStyle w:val="BodyText"/>
+      </w:pPr>
+      <w:r>
+        <w:t xml:space="preserve">Use </w:t>
+      </w:r>
+      <w:r>
+        <w:t xml:space="preserve">function </w:t>
+      </w:r>
+      <w:r>
+        <w:rPr>
+          <w:b/>
+          <w:bCs/>
+        </w:rPr>
+        <w:t>06</w:t>
+      </w:r>
+      <w:r>
+        <w:t xml:space="preserve"> - </w:t>
+      </w:r>
+      <w:hyperlink r:id="rId28" w:anchor="function06">
+        <w:r>
+          <w:rPr>
+            <w:rStyle w:val="Hyperlink"/>
+          </w:rPr>
+          <w:t>Write Single Register</w:t>
+        </w:r>
+      </w:hyperlink>
+      <w:r>
+        <w:t xml:space="preserve"> to </w:t>
+      </w:r>
+      <w:r>
+        <w:t>write</w:t>
+      </w:r>
+      <w:r>
+        <w:t xml:space="preserve"> </w:t>
+      </w:r>
+      <w:r>
+        <w:t xml:space="preserve">these </w:t>
+      </w:r>
+      <w:r>
+        <w:t>registers.</w:t>
+      </w:r>
+    </w:p>
+    <w:p>
+      <w:pPr>
+        <w:pStyle w:val="BodyText"/>
+      </w:pPr>
+      <w:r>
+        <w:t xml:space="preserve">Use </w:t>
+      </w:r>
+      <w:r>
+        <w:t xml:space="preserve">function </w:t>
+      </w:r>
+      <w:r>
+        <w:rPr>
+          <w:b/>
+          <w:bCs/>
+        </w:rPr>
+        <w:t>03</w:t>
+      </w:r>
+      <w:r>
+        <w:t xml:space="preserve"> - </w:t>
+      </w:r>
+      <w:hyperlink r:id="rId29" w:anchor="function03">
+        <w:r>
+          <w:rPr>
+            <w:rStyle w:val="Hyperlink"/>
+          </w:rPr>
+          <w:t>Read Holding Registers</w:t>
+        </w:r>
+      </w:hyperlink>
+      <w:r>
+        <w:t xml:space="preserve"> </w:t>
+      </w:r>
+      <w:r>
+        <w:t xml:space="preserve">to </w:t>
+      </w:r>
+      <w:r>
+        <w:t>read</w:t>
+      </w:r>
+      <w:r>
+        <w:t xml:space="preserve"> </w:t>
+      </w:r>
+      <w:r>
+        <w:t xml:space="preserve">these </w:t>
+      </w:r>
+      <w:r>
+        <w:t>registers.</w:t>
       </w:r>
     </w:p>
     <w:tbl>
@@ -17485,7 +18056,11 @@
               <w:cnfStyle w:val="000000100000" w:firstRow="0" w:lastRow="0" w:firstColumn="0" w:lastColumn="0" w:oddVBand="0" w:evenVBand="0" w:oddHBand="1" w:evenHBand="0" w:firstRowFirstColumn="0" w:firstRowLastColumn="0" w:lastRowFirstColumn="0" w:lastRowLastColumn="0"/>
             </w:pPr>
             <w:r>
-              <w:t>Mask to open relays on electrical infeed fault</w:t>
+              <w:t xml:space="preserve">Mask to open relays on electrical </w:t>
+            </w:r>
+            <w:r>
+              <w:lastRenderedPageBreak/>
+              <w:t>infeed fault</w:t>
             </w:r>
             <w:r>
               <w:t xml:space="preserve">, </w:t>
@@ -17544,6 +18119,7 @@
               <w:pStyle w:val="Compact"/>
             </w:pPr>
             <w:r>
+              <w:lastRenderedPageBreak/>
               <w:t>0</w:t>
             </w:r>
           </w:p>
@@ -17912,6 +18488,97 @@
           <w:color w:val="FF0000"/>
         </w:rPr>
         <w:t>16 is not supported.</w:t>
+      </w:r>
+    </w:p>
+    <w:p>
+      <w:pPr>
+        <w:pStyle w:val="BodyText"/>
+      </w:pPr>
+      <w:r>
+        <w:t xml:space="preserve">Use </w:t>
+      </w:r>
+      <w:r>
+        <w:t xml:space="preserve">function </w:t>
+      </w:r>
+      <w:r>
+        <w:rPr>
+          <w:b/>
+          <w:bCs/>
+        </w:rPr>
+        <w:t>06</w:t>
+      </w:r>
+      <w:r>
+        <w:t xml:space="preserve"> - </w:t>
+      </w:r>
+      <w:hyperlink r:id="rId30" w:anchor="function06">
+        <w:r>
+          <w:rPr>
+            <w:rStyle w:val="Hyperlink"/>
+          </w:rPr>
+          <w:t>Write Single Register</w:t>
+        </w:r>
+      </w:hyperlink>
+      <w:r>
+        <w:t xml:space="preserve"> to </w:t>
+      </w:r>
+      <w:r>
+        <w:t>write</w:t>
+      </w:r>
+      <w:r>
+        <w:t xml:space="preserve"> </w:t>
+      </w:r>
+      <w:r>
+        <w:t xml:space="preserve">these </w:t>
+      </w:r>
+      <w:r>
+        <w:t>registers.</w:t>
+      </w:r>
+    </w:p>
+    <w:p>
+      <w:pPr>
+        <w:pStyle w:val="BodyText"/>
+      </w:pPr>
+      <w:r>
+        <w:t xml:space="preserve">Use </w:t>
+      </w:r>
+      <w:r>
+        <w:t xml:space="preserve">function </w:t>
+      </w:r>
+      <w:r>
+        <w:rPr>
+          <w:b/>
+          <w:bCs/>
+        </w:rPr>
+        <w:t>03</w:t>
+      </w:r>
+      <w:r>
+        <w:t xml:space="preserve"> - </w:t>
+      </w:r>
+      <w:hyperlink r:id="rId31" w:anchor="function03">
+        <w:r>
+          <w:rPr>
+            <w:rStyle w:val="Hyperlink"/>
+          </w:rPr>
+          <w:t>Read Holding Registers</w:t>
+        </w:r>
+      </w:hyperlink>
+      <w:r>
+        <w:t xml:space="preserve"> </w:t>
+      </w:r>
+      <w:r>
+        <w:t xml:space="preserve">to </w:t>
+      </w:r>
+      <w:r>
+        <w:t>read</w:t>
+      </w:r>
+      <w:r>
+        <w:t xml:space="preserve"> </w:t>
+      </w:r>
+      <w:r>
+        <w:t xml:space="preserve">these </w:t>
+      </w:r>
+      <w:r>
+        <w:t>registers.</w:t>
       </w:r>
     </w:p>
     <w:tbl>
@@ -18101,7 +18768,13 @@
               <w:cnfStyle w:val="000000100000" w:firstRow="0" w:lastRow="0" w:firstColumn="0" w:lastColumn="0" w:oddVBand="0" w:evenVBand="0" w:oddHBand="1" w:evenHBand="0" w:firstRowFirstColumn="0" w:firstRowLastColumn="0" w:lastRowFirstColumn="0" w:lastRowLastColumn="0"/>
             </w:pPr>
             <w:r>
-              <w:t>msb bits [15-8] are for the ON filter</w:t>
+              <w:t xml:space="preserve">msb bits [15-8] are for the </w:t>
+            </w:r>
+            <w:r>
+              <w:t>closed</w:t>
+            </w:r>
+            <w:r>
+              <w:t xml:space="preserve"> filter</w:t>
             </w:r>
             <w:r>
               <w:t>.</w:t>
@@ -18110,7 +18783,13 @@
               <w:br/>
             </w:r>
             <w:r>
-              <w:t>lsb bits [7-0] are the OFF filter</w:t>
+              <w:t xml:space="preserve">lsb bits [7-0] are the </w:t>
+            </w:r>
+            <w:r>
+              <w:t>opened</w:t>
+            </w:r>
+            <w:r>
+              <w:t xml:space="preserve"> filter</w:t>
             </w:r>
             <w:r>
               <w:t>.</w:t>
@@ -18588,6 +19267,50 @@
         <w:t xml:space="preserve"> for this group. Function 16 - Write Multiple Registers is not available. The registers must be written individually.</w:t>
       </w:r>
     </w:p>
+    <w:p>
+      <w:pPr>
+        <w:pStyle w:val="BodyText"/>
+      </w:pPr>
+      <w:r>
+        <w:t xml:space="preserve">Use </w:t>
+      </w:r>
+      <w:r>
+        <w:t xml:space="preserve">function </w:t>
+      </w:r>
+      <w:r>
+        <w:rPr>
+          <w:b/>
+          <w:bCs/>
+        </w:rPr>
+        <w:t>06</w:t>
+      </w:r>
+      <w:r>
+        <w:t xml:space="preserve"> - </w:t>
+      </w:r>
+      <w:hyperlink r:id="rId32" w:anchor="function06">
+        <w:r>
+          <w:rPr>
+            <w:rStyle w:val="Hyperlink"/>
+          </w:rPr>
+          <w:t>Write Single Register</w:t>
+        </w:r>
+      </w:hyperlink>
+      <w:r>
+        <w:t xml:space="preserve"> to </w:t>
+      </w:r>
+      <w:r>
+        <w:t>write</w:t>
+      </w:r>
+      <w:r>
+        <w:t xml:space="preserve"> </w:t>
+      </w:r>
+      <w:r>
+        <w:t xml:space="preserve">these </w:t>
+      </w:r>
+      <w:r>
+        <w:t>registers.</w:t>
+      </w:r>
+    </w:p>
     <w:tbl>
       <w:tblPr>
         <w:tblStyle w:val="GridTable4-Accent1"/>
@@ -18595,11 +19318,11 @@
         <w:tblLook w:val="0020" w:firstRow="1" w:lastRow="0" w:firstColumn="0" w:lastColumn="0" w:noHBand="0" w:noVBand="0"/>
       </w:tblPr>
       <w:tblGrid>
-        <w:gridCol w:w="1512"/>
-        <w:gridCol w:w="1095"/>
+        <w:gridCol w:w="1592"/>
+        <w:gridCol w:w="1125"/>
         <w:gridCol w:w="885"/>
-        <w:gridCol w:w="4108"/>
-        <w:gridCol w:w="1976"/>
+        <w:gridCol w:w="4532"/>
+        <w:gridCol w:w="1442"/>
       </w:tblGrid>
       <w:tr>
         <w:trPr>
@@ -18704,7 +19427,7 @@
               <w:cnfStyle w:val="000000100000" w:firstRow="0" w:lastRow="0" w:firstColumn="0" w:lastColumn="0" w:oddVBand="0" w:evenVBand="0" w:oddHBand="1" w:evenHBand="0" w:firstRowFirstColumn="0" w:firstRowLastColumn="0" w:lastRowFirstColumn="0" w:lastRowLastColumn="0"/>
             </w:pPr>
             <w:r>
-              <w:t>0x0064</w:t>
+              <w:tab/>
             </w:r>
           </w:p>
         </w:tc>
@@ -18899,7 +19622,15 @@
               <w:pStyle w:val="Compact"/>
             </w:pPr>
             <w:r>
-              <w:t>0 = Turn off1 = Turn on</w:t>
+              <w:t>0 = Turn off</w:t>
+            </w:r>
+          </w:p>
+          <w:p>
+            <w:pPr>
+              <w:pStyle w:val="Compact"/>
+            </w:pPr>
+            <w:r>
+              <w:t>1 = Turn on</w:t>
             </w:r>
           </w:p>
         </w:tc>
@@ -19416,7 +20147,7 @@
       <w:r>
         <w:t xml:space="preserve">For relay data, refer to the datasheet of the </w:t>
       </w:r>
-      <w:hyperlink r:id="rId22">
+      <w:hyperlink r:id="rId33">
         <w:r>
           <w:rPr>
             <w:rStyle w:val="Hyperlink"/>
@@ -21062,7 +21793,15 @@
               <w:pStyle w:val="Compact"/>
             </w:pPr>
             <w:r>
-              <w:t xml:space="preserve">Loss of comms indicates the bus is damaged or the </w:t>
+              <w:t xml:space="preserve">Loss of </w:t>
+            </w:r>
+            <w:proofErr w:type="gramStart"/>
+            <w:r>
+              <w:t>comms indicates</w:t>
+            </w:r>
+            <w:proofErr w:type="gramEnd"/>
+            <w:r>
+              <w:t xml:space="preserve"> the bus is damaged or the </w:t>
             </w:r>
             <w:r>
               <w:t xml:space="preserve">Modbus </w:t>
@@ -21089,7 +21828,15 @@
               <w:pStyle w:val="Compact"/>
             </w:pPr>
             <w:r>
-              <w:t xml:space="preserve">Test of the </w:t>
+              <w:t xml:space="preserve">Test </w:t>
+            </w:r>
+            <w:proofErr w:type="gramStart"/>
+            <w:r>
+              <w:t>of</w:t>
+            </w:r>
+            <w:proofErr w:type="gramEnd"/>
+            <w:r>
+              <w:t xml:space="preserve"> the </w:t>
             </w:r>
             <w:r>
               <w:t>ESt</w:t>
@@ -21374,7 +22121,7 @@
       <w:bookmarkEnd w:id="104"/>
     </w:p>
     <w:sectPr>
-      <w:footerReference w:type="default" r:id="rId23"/>
+      <w:footerReference w:type="default" r:id="rId34"/>
       <w:pgSz w:w="12240" w:h="15840"/>
       <w:pgMar w:top="1440" w:right="1440" w:bottom="1440" w:left="1440" w:header="720" w:footer="720" w:gutter="0"/>
       <w:pgNumType w:start="0"/>
@@ -21488,6 +22235,28 @@
       </w:r>
     </w:p>
   </w:footnote>
+  <w:footnote w:id="1">
+    <w:p>
+      <w:pPr>
+        <w:pStyle w:val="FootnoteText"/>
+        <w:rPr>
+          <w:lang w:val="en-GB"/>
+        </w:rPr>
+      </w:pPr>
+      <w:r>
+        <w:rPr>
+          <w:rStyle w:val="FootnoteReference"/>
+        </w:rPr>
+        <w:footnoteRef/>
+      </w:r>
+      <w:r>
+        <w:t xml:space="preserve"> </w:t>
+      </w:r>
+      <w:r>
+        <w:t>https://github.com/adarwoo/rtu_guardian</w:t>
+      </w:r>
+    </w:p>
+  </w:footnote>
 </w:footnotes>
 </file>
 
@@ -21574,7 +22343,7 @@
   <w:abstractNum w:abstractNumId="1" w15:restartNumberingAfterBreak="0">
     <w:nsid w:val="00A99411"/>
     <w:multiLevelType w:val="multilevel"/>
-    <w:tmpl w:val="AC283056"/>
+    <w:tmpl w:val="EFA8C560"/>
     <w:lvl w:ilvl="0">
       <w:start w:val="1"/>
       <w:numFmt w:val="decimal"/>
@@ -21583,84 +22352,165 @@
       <w:pPr>
         <w:ind w:left="720" w:hanging="480"/>
       </w:pPr>
+      <w:rPr>
+        <w:rFonts w:hint="default"/>
+      </w:rPr>
     </w:lvl>
     <w:lvl w:ilvl="1">
-      <w:start w:val="1"/>
       <w:numFmt w:val="bullet"/>
-      <w:lvlText w:val=""/>
+      <w:lvlText w:val="–"/>
       <w:lvlJc w:val="left"/>
       <w:pPr>
-        <w:ind w:left="1320" w:hanging="360"/>
+        <w:ind w:left="1440" w:hanging="480"/>
       </w:pPr>
       <w:rPr>
-        <w:rFonts w:ascii="Symbol" w:hAnsi="Symbol" w:hint="default"/>
+        <w:rFonts w:hint="default"/>
       </w:rPr>
     </w:lvl>
     <w:lvl w:ilvl="2">
+      <w:numFmt w:val="bullet"/>
+      <w:lvlText w:val="•"/>
+      <w:lvlJc w:val="left"/>
+      <w:pPr>
+        <w:ind w:left="2160" w:hanging="480"/>
+      </w:pPr>
+    </w:lvl>
+    <w:lvl w:ilvl="3">
+      <w:numFmt w:val="bullet"/>
+      <w:lvlText w:val="–"/>
+      <w:lvlJc w:val="left"/>
+      <w:pPr>
+        <w:ind w:left="2880" w:hanging="480"/>
+      </w:pPr>
+    </w:lvl>
+    <w:lvl w:ilvl="4">
+      <w:numFmt w:val="bullet"/>
+      <w:lvlText w:val="•"/>
+      <w:lvlJc w:val="left"/>
+      <w:pPr>
+        <w:ind w:left="3600" w:hanging="480"/>
+      </w:pPr>
+    </w:lvl>
+    <w:lvl w:ilvl="5">
+      <w:numFmt w:val="bullet"/>
+      <w:lvlText w:val="–"/>
+      <w:lvlJc w:val="left"/>
+      <w:pPr>
+        <w:ind w:left="4320" w:hanging="480"/>
+      </w:pPr>
+    </w:lvl>
+    <w:lvl w:ilvl="6">
+      <w:numFmt w:val="bullet"/>
+      <w:lvlText w:val="•"/>
+      <w:lvlJc w:val="left"/>
+      <w:pPr>
+        <w:ind w:left="5040" w:hanging="480"/>
+      </w:pPr>
+    </w:lvl>
+    <w:lvl w:ilvl="7">
+      <w:numFmt w:val="bullet"/>
+      <w:lvlText w:val="–"/>
+      <w:lvlJc w:val="left"/>
+      <w:pPr>
+        <w:ind w:left="5760" w:hanging="480"/>
+      </w:pPr>
+    </w:lvl>
+    <w:lvl w:ilvl="8">
+      <w:numFmt w:val="bullet"/>
+      <w:lvlText w:val="•"/>
+      <w:lvlJc w:val="left"/>
+      <w:pPr>
+        <w:ind w:left="6480" w:hanging="480"/>
+      </w:pPr>
+    </w:lvl>
+  </w:abstractNum>
+  <w:abstractNum w:abstractNumId="2" w15:restartNumberingAfterBreak="0">
+    <w:nsid w:val="109420C0"/>
+    <w:multiLevelType w:val="hybridMultilevel"/>
+    <w:tmpl w:val="44586602"/>
+    <w:lvl w:ilvl="0" w:tplc="0809000F">
       <w:start w:val="1"/>
       <w:numFmt w:val="decimal"/>
+      <w:lvlText w:val="%1."/>
+      <w:lvlJc w:val="left"/>
+      <w:pPr>
+        <w:ind w:left="720" w:hanging="360"/>
+      </w:pPr>
+    </w:lvl>
+    <w:lvl w:ilvl="1" w:tplc="08090019" w:tentative="1">
+      <w:start w:val="1"/>
+      <w:numFmt w:val="lowerLetter"/>
+      <w:lvlText w:val="%2."/>
+      <w:lvlJc w:val="left"/>
+      <w:pPr>
+        <w:ind w:left="1440" w:hanging="360"/>
+      </w:pPr>
+    </w:lvl>
+    <w:lvl w:ilvl="2" w:tplc="0809001B" w:tentative="1">
+      <w:start w:val="1"/>
+      <w:numFmt w:val="lowerRoman"/>
       <w:lvlText w:val="%3."/>
-      <w:lvlJc w:val="left"/>
-      <w:pPr>
-        <w:ind w:left="2160" w:hanging="480"/>
+      <w:lvlJc w:val="right"/>
+      <w:pPr>
+        <w:ind w:left="2160" w:hanging="180"/>
       </w:pPr>
     </w:lvl>
-    <w:lvl w:ilvl="3">
+    <w:lvl w:ilvl="3" w:tplc="0809000F" w:tentative="1">
       <w:start w:val="1"/>
       <w:numFmt w:val="decimal"/>
       <w:lvlText w:val="%4."/>
       <w:lvlJc w:val="left"/>
       <w:pPr>
-        <w:ind w:left="2880" w:hanging="480"/>
+        <w:ind w:left="2880" w:hanging="360"/>
       </w:pPr>
     </w:lvl>
-    <w:lvl w:ilvl="4">
+    <w:lvl w:ilvl="4" w:tplc="08090019" w:tentative="1">
       <w:start w:val="1"/>
-      <w:numFmt w:val="decimal"/>
+      <w:numFmt w:val="lowerLetter"/>
       <w:lvlText w:val="%5."/>
       <w:lvlJc w:val="left"/>
       <w:pPr>
-        <w:ind w:left="3600" w:hanging="480"/>
+        <w:ind w:left="3600" w:hanging="360"/>
       </w:pPr>
     </w:lvl>
-    <w:lvl w:ilvl="5">
+    <w:lvl w:ilvl="5" w:tplc="0809001B" w:tentative="1">
       <w:start w:val="1"/>
-      <w:numFmt w:val="decimal"/>
+      <w:numFmt w:val="lowerRoman"/>
       <w:lvlText w:val="%6."/>
-      <w:lvlJc w:val="left"/>
-      <w:pPr>
-        <w:ind w:left="4320" w:hanging="480"/>
+      <w:lvlJc w:val="right"/>
+      <w:pPr>
+        <w:ind w:left="4320" w:hanging="180"/>
       </w:pPr>
     </w:lvl>
-    <w:lvl w:ilvl="6">
+    <w:lvl w:ilvl="6" w:tplc="0809000F" w:tentative="1">
       <w:start w:val="1"/>
       <w:numFmt w:val="decimal"/>
       <w:lvlText w:val="%7."/>
       <w:lvlJc w:val="left"/>
       <w:pPr>
-        <w:ind w:left="5040" w:hanging="480"/>
+        <w:ind w:left="5040" w:hanging="360"/>
       </w:pPr>
     </w:lvl>
-    <w:lvl w:ilvl="7">
+    <w:lvl w:ilvl="7" w:tplc="08090019" w:tentative="1">
       <w:start w:val="1"/>
-      <w:numFmt w:val="decimal"/>
+      <w:numFmt w:val="lowerLetter"/>
       <w:lvlText w:val="%8."/>
       <w:lvlJc w:val="left"/>
       <w:pPr>
-        <w:ind w:left="5760" w:hanging="480"/>
+        <w:ind w:left="5760" w:hanging="360"/>
       </w:pPr>
     </w:lvl>
-    <w:lvl w:ilvl="8">
+    <w:lvl w:ilvl="8" w:tplc="0809001B" w:tentative="1">
       <w:start w:val="1"/>
-      <w:numFmt w:val="decimal"/>
+      <w:numFmt w:val="lowerRoman"/>
       <w:lvlText w:val="%9."/>
-      <w:lvlJc w:val="left"/>
-      <w:pPr>
-        <w:ind w:left="6480" w:hanging="480"/>
+      <w:lvlJc w:val="right"/>
+      <w:pPr>
+        <w:ind w:left="6480" w:hanging="180"/>
       </w:pPr>
     </w:lvl>
   </w:abstractNum>
-  <w:abstractNum w:abstractNumId="2" w15:restartNumberingAfterBreak="0">
+  <w:abstractNum w:abstractNumId="3" w15:restartNumberingAfterBreak="0">
     <w:nsid w:val="1482775B"/>
     <w:multiLevelType w:val="multilevel"/>
     <w:tmpl w:val="0EBA3C40"/>
@@ -21755,7 +22605,7 @@
       </w:pPr>
     </w:lvl>
   </w:abstractNum>
-  <w:abstractNum w:abstractNumId="3" w15:restartNumberingAfterBreak="0">
+  <w:abstractNum w:abstractNumId="4" w15:restartNumberingAfterBreak="0">
     <w:nsid w:val="2084310F"/>
     <w:multiLevelType w:val="multilevel"/>
     <w:tmpl w:val="D3E8F39E"/>
@@ -21860,7 +22710,91 @@
       </w:rPr>
     </w:lvl>
   </w:abstractNum>
-  <w:abstractNum w:abstractNumId="4" w15:restartNumberingAfterBreak="0">
+  <w:abstractNum w:abstractNumId="5" w15:restartNumberingAfterBreak="0">
+    <w:nsid w:val="28F50040"/>
+    <w:multiLevelType w:val="multilevel"/>
+    <w:tmpl w:val="EFA8C560"/>
+    <w:lvl w:ilvl="0">
+      <w:start w:val="1"/>
+      <w:numFmt w:val="decimal"/>
+      <w:lvlText w:val="%1."/>
+      <w:lvlJc w:val="left"/>
+      <w:pPr>
+        <w:ind w:left="720" w:hanging="480"/>
+      </w:pPr>
+      <w:rPr>
+        <w:rFonts w:hint="default"/>
+      </w:rPr>
+    </w:lvl>
+    <w:lvl w:ilvl="1">
+      <w:numFmt w:val="bullet"/>
+      <w:lvlText w:val="–"/>
+      <w:lvlJc w:val="left"/>
+      <w:pPr>
+        <w:ind w:left="1440" w:hanging="480"/>
+      </w:pPr>
+      <w:rPr>
+        <w:rFonts w:hint="default"/>
+      </w:rPr>
+    </w:lvl>
+    <w:lvl w:ilvl="2">
+      <w:numFmt w:val="bullet"/>
+      <w:lvlText w:val="•"/>
+      <w:lvlJc w:val="left"/>
+      <w:pPr>
+        <w:ind w:left="2160" w:hanging="480"/>
+      </w:pPr>
+    </w:lvl>
+    <w:lvl w:ilvl="3">
+      <w:numFmt w:val="bullet"/>
+      <w:lvlText w:val="–"/>
+      <w:lvlJc w:val="left"/>
+      <w:pPr>
+        <w:ind w:left="2880" w:hanging="480"/>
+      </w:pPr>
+    </w:lvl>
+    <w:lvl w:ilvl="4">
+      <w:numFmt w:val="bullet"/>
+      <w:lvlText w:val="•"/>
+      <w:lvlJc w:val="left"/>
+      <w:pPr>
+        <w:ind w:left="3600" w:hanging="480"/>
+      </w:pPr>
+    </w:lvl>
+    <w:lvl w:ilvl="5">
+      <w:numFmt w:val="bullet"/>
+      <w:lvlText w:val="–"/>
+      <w:lvlJc w:val="left"/>
+      <w:pPr>
+        <w:ind w:left="4320" w:hanging="480"/>
+      </w:pPr>
+    </w:lvl>
+    <w:lvl w:ilvl="6">
+      <w:numFmt w:val="bullet"/>
+      <w:lvlText w:val="•"/>
+      <w:lvlJc w:val="left"/>
+      <w:pPr>
+        <w:ind w:left="5040" w:hanging="480"/>
+      </w:pPr>
+    </w:lvl>
+    <w:lvl w:ilvl="7">
+      <w:numFmt w:val="bullet"/>
+      <w:lvlText w:val="–"/>
+      <w:lvlJc w:val="left"/>
+      <w:pPr>
+        <w:ind w:left="5760" w:hanging="480"/>
+      </w:pPr>
+    </w:lvl>
+    <w:lvl w:ilvl="8">
+      <w:numFmt w:val="bullet"/>
+      <w:lvlText w:val="•"/>
+      <w:lvlJc w:val="left"/>
+      <w:pPr>
+        <w:ind w:left="6480" w:hanging="480"/>
+      </w:pPr>
+    </w:lvl>
+  </w:abstractNum>
+  <w:abstractNum w:abstractNumId="6" w15:restartNumberingAfterBreak="0">
     <w:nsid w:val="2FF04B5E"/>
     <w:multiLevelType w:val="multilevel"/>
     <w:tmpl w:val="7E784BF6"/>
@@ -21965,7 +22899,7 @@
       </w:rPr>
     </w:lvl>
   </w:abstractNum>
-  <w:abstractNum w:abstractNumId="5" w15:restartNumberingAfterBreak="0">
+  <w:abstractNum w:abstractNumId="7" w15:restartNumberingAfterBreak="0">
     <w:nsid w:val="340C635B"/>
     <w:multiLevelType w:val="hybridMultilevel"/>
     <w:tmpl w:val="D0F60924"/>
@@ -22051,7 +22985,7 @@
       </w:pPr>
     </w:lvl>
   </w:abstractNum>
-  <w:abstractNum w:abstractNumId="6" w15:restartNumberingAfterBreak="0">
+  <w:abstractNum w:abstractNumId="8" w15:restartNumberingAfterBreak="0">
     <w:nsid w:val="41AC28A7"/>
     <w:multiLevelType w:val="multilevel"/>
     <w:tmpl w:val="381C0850"/>
@@ -22156,7 +23090,7 @@
       </w:rPr>
     </w:lvl>
   </w:abstractNum>
-  <w:abstractNum w:abstractNumId="7" w15:restartNumberingAfterBreak="0">
+  <w:abstractNum w:abstractNumId="9" w15:restartNumberingAfterBreak="0">
     <w:nsid w:val="43B81CD4"/>
     <w:multiLevelType w:val="multilevel"/>
     <w:tmpl w:val="815E7166"/>
@@ -22234,7 +23168,7 @@
       </w:pPr>
     </w:lvl>
   </w:abstractNum>
-  <w:abstractNum w:abstractNumId="8" w15:restartNumberingAfterBreak="0">
+  <w:abstractNum w:abstractNumId="10" w15:restartNumberingAfterBreak="0">
     <w:nsid w:val="628C7115"/>
     <w:multiLevelType w:val="multilevel"/>
     <w:tmpl w:val="815E7166"/>
@@ -22312,7 +23246,7 @@
       </w:pPr>
     </w:lvl>
   </w:abstractNum>
-  <w:abstractNum w:abstractNumId="9" w15:restartNumberingAfterBreak="0">
+  <w:abstractNum w:abstractNumId="11" w15:restartNumberingAfterBreak="0">
     <w:nsid w:val="66EC4440"/>
     <w:multiLevelType w:val="multilevel"/>
     <w:tmpl w:val="815E7166"/>
@@ -22390,7 +23324,91 @@
       </w:pPr>
     </w:lvl>
   </w:abstractNum>
-  <w:abstractNum w:abstractNumId="10" w15:restartNumberingAfterBreak="0">
+  <w:abstractNum w:abstractNumId="12" w15:restartNumberingAfterBreak="0">
+    <w:nsid w:val="685D0480"/>
+    <w:multiLevelType w:val="multilevel"/>
+    <w:tmpl w:val="EFA8C560"/>
+    <w:lvl w:ilvl="0">
+      <w:start w:val="1"/>
+      <w:numFmt w:val="decimal"/>
+      <w:lvlText w:val="%1."/>
+      <w:lvlJc w:val="left"/>
+      <w:pPr>
+        <w:ind w:left="720" w:hanging="480"/>
+      </w:pPr>
+      <w:rPr>
+        <w:rFonts w:hint="default"/>
+      </w:rPr>
+    </w:lvl>
+    <w:lvl w:ilvl="1">
+      <w:numFmt w:val="bullet"/>
+      <w:lvlText w:val="–"/>
+      <w:lvlJc w:val="left"/>
+      <w:pPr>
+        <w:ind w:left="1440" w:hanging="480"/>
+      </w:pPr>
+      <w:rPr>
+        <w:rFonts w:hint="default"/>
+      </w:rPr>
+    </w:lvl>
+    <w:lvl w:ilvl="2">
+      <w:numFmt w:val="bullet"/>
+      <w:lvlText w:val="•"/>
+      <w:lvlJc w:val="left"/>
+      <w:pPr>
+        <w:ind w:left="2160" w:hanging="480"/>
+      </w:pPr>
+    </w:lvl>
+    <w:lvl w:ilvl="3">
+      <w:numFmt w:val="bullet"/>
+      <w:lvlText w:val="–"/>
+      <w:lvlJc w:val="left"/>
+      <w:pPr>
+        <w:ind w:left="2880" w:hanging="480"/>
+      </w:pPr>
+    </w:lvl>
+    <w:lvl w:ilvl="4">
+      <w:numFmt w:val="bullet"/>
+      <w:lvlText w:val="•"/>
+      <w:lvlJc w:val="left"/>
+      <w:pPr>
+        <w:ind w:left="3600" w:hanging="480"/>
+      </w:pPr>
+    </w:lvl>
+    <w:lvl w:ilvl="5">
+      <w:numFmt w:val="bullet"/>
+      <w:lvlText w:val="–"/>
+      <w:lvlJc w:val="left"/>
+      <w:pPr>
+        <w:ind w:left="4320" w:hanging="480"/>
+      </w:pPr>
+    </w:lvl>
+    <w:lvl w:ilvl="6">
+      <w:numFmt w:val="bullet"/>
+      <w:lvlText w:val="•"/>
+      <w:lvlJc w:val="left"/>
+      <w:pPr>
+        <w:ind w:left="5040" w:hanging="480"/>
+      </w:pPr>
+    </w:lvl>
+    <w:lvl w:ilvl="7">
+      <w:numFmt w:val="bullet"/>
+      <w:lvlText w:val="–"/>
+      <w:lvlJc w:val="left"/>
+      <w:pPr>
+        <w:ind w:left="5760" w:hanging="480"/>
+      </w:pPr>
+    </w:lvl>
+    <w:lvl w:ilvl="8">
+      <w:numFmt w:val="bullet"/>
+      <w:lvlText w:val="•"/>
+      <w:lvlJc w:val="left"/>
+      <w:pPr>
+        <w:ind w:left="6480" w:hanging="480"/>
+      </w:pPr>
+    </w:lvl>
+  </w:abstractNum>
+  <w:abstractNum w:abstractNumId="13" w15:restartNumberingAfterBreak="0">
     <w:nsid w:val="6B197A89"/>
     <w:multiLevelType w:val="multilevel"/>
     <w:tmpl w:val="815E7166"/>
@@ -22468,7 +23486,7 @@
       </w:pPr>
     </w:lvl>
   </w:abstractNum>
-  <w:abstractNum w:abstractNumId="11" w15:restartNumberingAfterBreak="0">
+  <w:abstractNum w:abstractNumId="14" w15:restartNumberingAfterBreak="0">
     <w:nsid w:val="6CE60992"/>
     <w:multiLevelType w:val="multilevel"/>
     <w:tmpl w:val="815E7166"/>
@@ -22546,7 +23564,7 @@
       </w:pPr>
     </w:lvl>
   </w:abstractNum>
-  <w:abstractNum w:abstractNumId="12" w15:restartNumberingAfterBreak="0">
+  <w:abstractNum w:abstractNumId="15" w15:restartNumberingAfterBreak="0">
     <w:nsid w:val="6D546C56"/>
     <w:multiLevelType w:val="multilevel"/>
     <w:tmpl w:val="815E7166"/>
@@ -22624,7 +23642,7 @@
       </w:pPr>
     </w:lvl>
   </w:abstractNum>
-  <w:abstractNum w:abstractNumId="13" w15:restartNumberingAfterBreak="0">
+  <w:abstractNum w:abstractNumId="16" w15:restartNumberingAfterBreak="0">
     <w:nsid w:val="70E14A90"/>
     <w:multiLevelType w:val="multilevel"/>
     <w:tmpl w:val="815E7166"/>
@@ -22702,7 +23720,7 @@
       </w:pPr>
     </w:lvl>
   </w:abstractNum>
-  <w:abstractNum w:abstractNumId="14" w15:restartNumberingAfterBreak="0">
+  <w:abstractNum w:abstractNumId="17" w15:restartNumberingAfterBreak="0">
     <w:nsid w:val="73665C90"/>
     <w:multiLevelType w:val="multilevel"/>
     <w:tmpl w:val="381C0850"/>
@@ -22807,7 +23825,7 @@
       </w:rPr>
     </w:lvl>
   </w:abstractNum>
-  <w:abstractNum w:abstractNumId="15" w15:restartNumberingAfterBreak="0">
+  <w:abstractNum w:abstractNumId="18" w15:restartNumberingAfterBreak="0">
     <w:nsid w:val="78786C81"/>
     <w:multiLevelType w:val="multilevel"/>
     <w:tmpl w:val="7E784BF6"/>
@@ -22944,33 +23962,6 @@
   </w:num>
   <w:num w:numId="11" w16cid:durableId="2113472219">
     <w:abstractNumId w:val="1"/>
-    <w:lvlOverride w:ilvl="0">
-      <w:startOverride w:val="1"/>
-    </w:lvlOverride>
-    <w:lvlOverride w:ilvl="1">
-      <w:startOverride w:val="1"/>
-    </w:lvlOverride>
-    <w:lvlOverride w:ilvl="2">
-      <w:startOverride w:val="1"/>
-    </w:lvlOverride>
-    <w:lvlOverride w:ilvl="3">
-      <w:startOverride w:val="1"/>
-    </w:lvlOverride>
-    <w:lvlOverride w:ilvl="4">
-      <w:startOverride w:val="1"/>
-    </w:lvlOverride>
-    <w:lvlOverride w:ilvl="5">
-      <w:startOverride w:val="1"/>
-    </w:lvlOverride>
-    <w:lvlOverride w:ilvl="6">
-      <w:startOverride w:val="1"/>
-    </w:lvlOverride>
-    <w:lvlOverride w:ilvl="7">
-      <w:startOverride w:val="1"/>
-    </w:lvlOverride>
-    <w:lvlOverride w:ilvl="8">
-      <w:startOverride w:val="1"/>
-    </w:lvlOverride>
   </w:num>
   <w:num w:numId="12" w16cid:durableId="1959405820">
     <w:abstractNumId w:val="0"/>
@@ -23081,46 +24072,55 @@
     <w:abstractNumId w:val="0"/>
   </w:num>
   <w:num w:numId="21" w16cid:durableId="847476483">
-    <w:abstractNumId w:val="2"/>
+    <w:abstractNumId w:val="3"/>
   </w:num>
   <w:num w:numId="22" w16cid:durableId="1667977238">
-    <w:abstractNumId w:val="3"/>
+    <w:abstractNumId w:val="4"/>
   </w:num>
   <w:num w:numId="23" w16cid:durableId="684985809">
+    <w:abstractNumId w:val="8"/>
+  </w:num>
+  <w:num w:numId="24" w16cid:durableId="488715215">
     <w:abstractNumId w:val="6"/>
   </w:num>
-  <w:num w:numId="24" w16cid:durableId="488715215">
-    <w:abstractNumId w:val="4"/>
+  <w:num w:numId="25" w16cid:durableId="618494513">
+    <w:abstractNumId w:val="17"/>
   </w:num>
-  <w:num w:numId="25" w16cid:durableId="618494513">
+  <w:num w:numId="26" w16cid:durableId="1912494872">
+    <w:abstractNumId w:val="18"/>
+  </w:num>
+  <w:num w:numId="27" w16cid:durableId="1713724579">
     <w:abstractNumId w:val="14"/>
   </w:num>
-  <w:num w:numId="26" w16cid:durableId="1912494872">
+  <w:num w:numId="28" w16cid:durableId="1028022559">
+    <w:abstractNumId w:val="16"/>
+  </w:num>
+  <w:num w:numId="29" w16cid:durableId="2040810020">
+    <w:abstractNumId w:val="10"/>
+  </w:num>
+  <w:num w:numId="30" w16cid:durableId="959072585">
+    <w:abstractNumId w:val="13"/>
+  </w:num>
+  <w:num w:numId="31" w16cid:durableId="521624884">
+    <w:abstractNumId w:val="9"/>
+  </w:num>
+  <w:num w:numId="32" w16cid:durableId="1913735871">
     <w:abstractNumId w:val="15"/>
   </w:num>
-  <w:num w:numId="27" w16cid:durableId="1713724579">
+  <w:num w:numId="33" w16cid:durableId="138888562">
     <w:abstractNumId w:val="11"/>
   </w:num>
-  <w:num w:numId="28" w16cid:durableId="1028022559">
-    <w:abstractNumId w:val="13"/>
-  </w:num>
-  <w:num w:numId="29" w16cid:durableId="2040810020">
-    <w:abstractNumId w:val="8"/>
-  </w:num>
-  <w:num w:numId="30" w16cid:durableId="959072585">
-    <w:abstractNumId w:val="10"/>
-  </w:num>
-  <w:num w:numId="31" w16cid:durableId="521624884">
+  <w:num w:numId="34" w16cid:durableId="1924336855">
     <w:abstractNumId w:val="7"/>
   </w:num>
-  <w:num w:numId="32" w16cid:durableId="1913735871">
+  <w:num w:numId="35" w16cid:durableId="1016885903">
+    <w:abstractNumId w:val="5"/>
+  </w:num>
+  <w:num w:numId="36" w16cid:durableId="1686054014">
     <w:abstractNumId w:val="12"/>
   </w:num>
-  <w:num w:numId="33" w16cid:durableId="138888562">
-    <w:abstractNumId w:val="9"/>
-  </w:num>
-  <w:num w:numId="34" w16cid:durableId="1924336855">
-    <w:abstractNumId w:val="5"/>
+  <w:num w:numId="37" w16cid:durableId="980234987">
+    <w:abstractNumId w:val="2"/>
   </w:num>
   <w:numIdMacAtCleanup w:val="33"/>
 </w:numbering>

</xml_diff>

<commit_message>
Still debugging. ULog mystery looks fixed (many many many added issues)
</commit_message>
<xml_diff>
--- a/docs/User_manual.docx
+++ b/docs/User_manual.docx
@@ -8033,13 +8033,7 @@
         <w:pStyle w:val="FirstParagraph"/>
       </w:pPr>
       <w:r>
-        <w:t xml:space="preserve">The closed-state filter defines how long the relay </w:t>
-      </w:r>
-      <w:r>
-        <w:t xml:space="preserve">will </w:t>
-      </w:r>
-      <w:r>
-        <w:t>remain closed before it can change state.</w:t>
+        <w:t>The closed-state filter defines how long the relay will remain closed before it can change state.</w:t>
       </w:r>
     </w:p>
     <w:p>
@@ -8083,8 +8077,6 @@
       </w:r>
       <w:r>
         <w:br/>
-      </w:r>
-      <w:r>
         <w:t>A relay has a minimum closed-cycle time of 4 seconds and no filter on the open state.</w:t>
       </w:r>
     </w:p>
@@ -14596,6 +14588,7 @@
               <w:pStyle w:val="Compact"/>
             </w:pPr>
             <w:r>
+              <w:lastRenderedPageBreak/>
               <w:t>30017</w:t>
             </w:r>
           </w:p>
@@ -18192,6 +18185,7 @@
               <w:pStyle w:val="Compact"/>
             </w:pPr>
             <w:r>
+              <w:lastRenderedPageBreak/>
               <w:t>40022</w:t>
             </w:r>
           </w:p>
@@ -19318,10 +19312,10 @@
         <w:tblLook w:val="0020" w:firstRow="1" w:lastRow="0" w:firstColumn="0" w:lastColumn="0" w:noHBand="0" w:noVBand="0"/>
       </w:tblPr>
       <w:tblGrid>
-        <w:gridCol w:w="1592"/>
-        <w:gridCol w:w="1125"/>
+        <w:gridCol w:w="1593"/>
+        <w:gridCol w:w="1123"/>
         <w:gridCol w:w="885"/>
-        <w:gridCol w:w="4532"/>
+        <w:gridCol w:w="4533"/>
         <w:gridCol w:w="1442"/>
       </w:tblGrid>
       <w:tr>
@@ -19426,6 +19420,9 @@
               <w:pStyle w:val="Compact"/>
               <w:cnfStyle w:val="000000100000" w:firstRow="0" w:lastRow="0" w:firstColumn="0" w:lastColumn="0" w:oddVBand="0" w:evenVBand="0" w:oddHBand="1" w:evenHBand="0" w:firstRowFirstColumn="0" w:firstRowLastColumn="0" w:lastRowFirstColumn="0" w:lastRowLastColumn="0"/>
             </w:pPr>
+            <w:r>
+              <w:t>0x0064</w:t>
+            </w:r>
             <w:r>
               <w:tab/>
             </w:r>
@@ -21676,6 +21673,7 @@
               <w:pStyle w:val="Compact"/>
             </w:pPr>
             <w:r>
+              <w:lastRenderedPageBreak/>
               <w:t>Modbus Communication</w:t>
             </w:r>
           </w:p>

</xml_diff>

<commit_message>
Cleaned the LED section. Aligning with the code and tests
</commit_message>
<xml_diff>
--- a/docs/User_manual.docx
+++ b/docs/User_manual.docx
@@ -122,7 +122,7 @@
               <w:noProof/>
             </w:rPr>
             <w:drawing>
-              <wp:anchor distT="0" distB="0" distL="114300" distR="114300" simplePos="0" relativeHeight="251655680" behindDoc="0" locked="0" layoutInCell="1" allowOverlap="1" wp14:anchorId="7F3500F7" wp14:editId="58EC2EA4">
+              <wp:anchor distT="0" distB="0" distL="114300" distR="114300" simplePos="0" relativeHeight="251661312" behindDoc="0" locked="0" layoutInCell="1" allowOverlap="1" wp14:anchorId="7F3500F7" wp14:editId="58EC2EA4">
                 <wp:simplePos x="0" y="0"/>
                 <wp:positionH relativeFrom="column">
                   <wp:posOffset>481230</wp:posOffset>
@@ -8632,7 +8632,10 @@
       </w:pPr>
       <w:r>
         <w:lastRenderedPageBreak/>
-        <w:t>When applying a DC source, t</w:t>
+        <w:t xml:space="preserve">When configuring the infeed as DC type, </w:t>
+      </w:r>
+      <w:r>
+        <w:t>t</w:t>
       </w:r>
       <w:r>
         <w:t>he negative</w:t>
@@ -8745,6 +8748,18 @@
         </w:numPr>
       </w:pPr>
       <w:r>
+        <w:t>Polarity inversion for DC configuration</w:t>
+      </w:r>
+    </w:p>
+    <w:p>
+      <w:pPr>
+        <w:pStyle w:val="Compact"/>
+        <w:numPr>
+          <w:ilvl w:val="0"/>
+          <w:numId w:val="13"/>
+        </w:numPr>
+      </w:pPr>
+      <w:r>
         <w:t>Incorrect type (AC vs DC) of the infeed</w:t>
       </w:r>
     </w:p>
@@ -10999,12 +11014,12 @@
     <w:tbl>
       <w:tblPr>
         <w:tblStyle w:val="GridTable4-Accent2"/>
-        <w:tblW w:w="0" w:type="auto"/>
+        <w:tblW w:w="9606" w:type="dxa"/>
         <w:tblLook w:val="0020" w:firstRow="1" w:lastRow="0" w:firstColumn="0" w:lastColumn="0" w:noHBand="0" w:noVBand="0"/>
       </w:tblPr>
       <w:tblGrid>
         <w:gridCol w:w="1369"/>
-        <w:gridCol w:w="5189"/>
+        <w:gridCol w:w="8237"/>
       </w:tblGrid>
       <w:tr>
         <w:trPr>
@@ -11026,7 +11041,7 @@
         </w:tc>
         <w:tc>
           <w:tcPr>
-            <w:tcW w:w="0" w:type="auto"/>
+            <w:tcW w:w="8237" w:type="dxa"/>
           </w:tcPr>
           <w:p>
             <w:pPr>
@@ -11059,7 +11074,7 @@
         </w:tc>
         <w:tc>
           <w:tcPr>
-            <w:tcW w:w="0" w:type="auto"/>
+            <w:tcW w:w="8237" w:type="dxa"/>
           </w:tcPr>
           <w:p>
             <w:pPr>
@@ -11067,7 +11082,13 @@
               <w:cnfStyle w:val="000000100000" w:firstRow="0" w:lastRow="0" w:firstColumn="0" w:lastColumn="0" w:oddVBand="0" w:evenVBand="0" w:oddHBand="1" w:evenHBand="0" w:firstRowFirstColumn="0" w:firstRowLastColumn="0" w:lastRowFirstColumn="0" w:lastRowLastColumn="0"/>
             </w:pPr>
             <w:r>
-              <w:t>Infeed voltage is &lt; 10V (AC+DC)</w:t>
+              <w:t>Infeed voltage is &lt; 10V (AC</w:t>
+            </w:r>
+            <w:r>
+              <w:t xml:space="preserve"> or </w:t>
+            </w:r>
+            <w:r>
+              <w:t>DC)</w:t>
             </w:r>
           </w:p>
         </w:tc>
@@ -11089,7 +11110,7 @@
         </w:tc>
         <w:tc>
           <w:tcPr>
-            <w:tcW w:w="0" w:type="auto"/>
+            <w:tcW w:w="8237" w:type="dxa"/>
           </w:tcPr>
           <w:p>
             <w:pPr>
@@ -11097,7 +11118,7 @@
               <w:cnfStyle w:val="000000000000" w:firstRow="0" w:lastRow="0" w:firstColumn="0" w:lastColumn="0" w:oddVBand="0" w:evenVBand="0" w:oddHBand="0" w:evenHBand="0" w:firstRowFirstColumn="0" w:firstRowLastColumn="0" w:lastRowFirstColumn="0" w:lastRowLastColumn="0"/>
             </w:pPr>
             <w:r>
-              <w:t>Infeed voltage detected, and within configured range</w:t>
+              <w:t>Infeed voltage detected</w:t>
             </w:r>
           </w:p>
         </w:tc>
@@ -11115,19 +11136,14 @@
             <w:pPr>
               <w:pStyle w:val="Compact"/>
             </w:pPr>
-            <w:proofErr w:type="gramStart"/>
-            <w:r>
-              <w:t>Flash .</w:t>
-            </w:r>
-            <w:proofErr w:type="gramEnd"/>
-            <w:r>
-              <w:t xml:space="preserve"> .</w:t>
-            </w:r>
-          </w:p>
-        </w:tc>
-        <w:tc>
-          <w:tcPr>
-            <w:tcW w:w="0" w:type="auto"/>
+            <w:r>
+              <w:t>Flash</w:t>
+            </w:r>
+          </w:p>
+        </w:tc>
+        <w:tc>
+          <w:tcPr>
+            <w:tcW w:w="8237" w:type="dxa"/>
           </w:tcPr>
           <w:p>
             <w:pPr>
@@ -11135,13 +11151,7 @@
               <w:cnfStyle w:val="000000100000" w:firstRow="0" w:lastRow="0" w:firstColumn="0" w:lastColumn="0" w:oddVBand="0" w:evenVBand="0" w:oddHBand="1" w:evenHBand="0" w:firstRowFirstColumn="0" w:firstRowLastColumn="0" w:lastRowFirstColumn="0" w:lastRowLastColumn="0"/>
             </w:pPr>
             <w:r>
-              <w:t>Voltage detect</w:t>
-            </w:r>
-            <w:r>
-              <w:t>ed</w:t>
-            </w:r>
-            <w:r>
-              <w:t>, but below the configured threshold</w:t>
+              <w:t>Triggering an EStop</w:t>
             </w:r>
           </w:p>
         </w:tc>
@@ -11157,13 +11167,13 @@
               <w:pStyle w:val="Compact"/>
             </w:pPr>
             <w:r>
-              <w:t>Flash _ _</w:t>
-            </w:r>
-          </w:p>
-        </w:tc>
-        <w:tc>
-          <w:tcPr>
-            <w:tcW w:w="0" w:type="auto"/>
+              <w:t>Pulsed</w:t>
+            </w:r>
+          </w:p>
+        </w:tc>
+        <w:tc>
+          <w:tcPr>
+            <w:tcW w:w="8237" w:type="dxa"/>
           </w:tcPr>
           <w:p>
             <w:pPr>
@@ -11171,46 +11181,7 @@
               <w:cnfStyle w:val="000000000000" w:firstRow="0" w:lastRow="0" w:firstColumn="0" w:lastColumn="0" w:oddVBand="0" w:evenVBand="0" w:oddHBand="0" w:evenHBand="0" w:firstRowFirstColumn="0" w:firstRowLastColumn="0" w:lastRowFirstColumn="0" w:lastRowLastColumn="0"/>
             </w:pPr>
             <w:r>
-              <w:t>Voltage detecting, but over the configured threshold</w:t>
-            </w:r>
-          </w:p>
-        </w:tc>
-      </w:tr>
-      <w:tr>
-        <w:trPr>
-          <w:cnfStyle w:val="000000100000" w:firstRow="0" w:lastRow="0" w:firstColumn="0" w:lastColumn="0" w:oddVBand="0" w:evenVBand="0" w:oddHBand="1" w:evenHBand="0" w:firstRowFirstColumn="0" w:firstRowLastColumn="0" w:lastRowFirstColumn="0" w:lastRowLastColumn="0"/>
-        </w:trPr>
-        <w:tc>
-          <w:tcPr>
-            <w:cnfStyle w:val="000010000000" w:firstRow="0" w:lastRow="0" w:firstColumn="0" w:lastColumn="0" w:oddVBand="1" w:evenVBand="0" w:oddHBand="0" w:evenHBand="0" w:firstRowFirstColumn="0" w:firstRowLastColumn="0" w:lastRowFirstColumn="0" w:lastRowLastColumn="0"/>
-            <w:tcW w:w="0" w:type="auto"/>
-          </w:tcPr>
-          <w:p>
-            <w:pPr>
-              <w:pStyle w:val="Compact"/>
-            </w:pPr>
-            <w:r>
-              <w:t>Flash at 2Hz</w:t>
-            </w:r>
-          </w:p>
-        </w:tc>
-        <w:tc>
-          <w:tcPr>
-            <w:tcW w:w="0" w:type="auto"/>
-          </w:tcPr>
-          <w:p>
-            <w:pPr>
-              <w:pStyle w:val="Compact"/>
-              <w:cnfStyle w:val="000000100000" w:firstRow="0" w:lastRow="0" w:firstColumn="0" w:lastColumn="0" w:oddVBand="0" w:evenVBand="0" w:oddHBand="1" w:evenHBand="0" w:firstRowFirstColumn="0" w:firstRowLastColumn="0" w:lastRowFirstColumn="0" w:lastRowLastColumn="0"/>
-            </w:pPr>
-            <w:r>
-              <w:t xml:space="preserve">Along with the EStop. </w:t>
-            </w:r>
-            <w:r>
-              <w:t>An</w:t>
-            </w:r>
-            <w:r>
-              <w:t xml:space="preserve"> infeed fault was detected.</w:t>
+              <w:t>Wrong type or outside of the range</w:t>
             </w:r>
           </w:p>
         </w:tc>
@@ -11355,8 +11326,8 @@
         <w:tblLook w:val="0020" w:firstRow="1" w:lastRow="0" w:firstColumn="0" w:lastColumn="0" w:noHBand="0" w:noVBand="0"/>
       </w:tblPr>
       <w:tblGrid>
-        <w:gridCol w:w="1274"/>
-        <w:gridCol w:w="8302"/>
+        <w:gridCol w:w="805"/>
+        <w:gridCol w:w="8771"/>
       </w:tblGrid>
       <w:tr>
         <w:trPr>
@@ -11477,7 +11448,7 @@
               <w:pStyle w:val="Compact"/>
             </w:pPr>
             <w:r>
-              <w:t>Flash at 2Hz</w:t>
+              <w:t>Flash</w:t>
             </w:r>
           </w:p>
         </w:tc>
@@ -11490,28 +11461,21 @@
               <w:pStyle w:val="Compact"/>
               <w:cnfStyle w:val="000000100000" w:firstRow="0" w:lastRow="0" w:firstColumn="0" w:lastColumn="0" w:oddVBand="0" w:evenVBand="0" w:oddHBand="1" w:evenHBand="0" w:firstRowFirstColumn="0" w:firstRowLastColumn="0" w:lastRowFirstColumn="0" w:lastRowLastColumn="0"/>
             </w:pPr>
-            <w:r>
-              <w:t>Along with the EStop</w:t>
-            </w:r>
-            <w:r>
-              <w:t xml:space="preserve"> LED, </w:t>
-            </w:r>
             <w:proofErr w:type="gramStart"/>
             <w:r>
-              <w:t>indicates</w:t>
+              <w:t>Has</w:t>
             </w:r>
             <w:proofErr w:type="gramEnd"/>
             <w:r>
-              <w:t xml:space="preserve"> a</w:t>
-            </w:r>
-            <w:r>
-              <w:t xml:space="preserve">n EStop </w:t>
-            </w:r>
-            <w:r>
-              <w:t xml:space="preserve">Modbus </w:t>
-            </w:r>
-            <w:r>
-              <w:t>command was received</w:t>
+              <w:t xml:space="preserve"> triggered and </w:t>
+            </w:r>
+            <w:proofErr w:type="gramStart"/>
+            <w:r>
+              <w:t>EStop</w:t>
+            </w:r>
+            <w:proofErr w:type="gramEnd"/>
+            <w:r>
+              <w:t>. Could be a command or watchdog</w:t>
             </w:r>
           </w:p>
         </w:tc>
@@ -11566,12 +11530,12 @@
     <w:tbl>
       <w:tblPr>
         <w:tblStyle w:val="GridTable4-Accent2"/>
-        <w:tblW w:w="0" w:type="auto"/>
+        <w:tblW w:w="9606" w:type="dxa"/>
         <w:tblLook w:val="0020" w:firstRow="1" w:lastRow="0" w:firstColumn="0" w:lastColumn="0" w:noHBand="0" w:noVBand="0"/>
       </w:tblPr>
       <w:tblGrid>
-        <w:gridCol w:w="1369"/>
-        <w:gridCol w:w="4836"/>
+        <w:gridCol w:w="919"/>
+        <w:gridCol w:w="8687"/>
       </w:tblGrid>
       <w:tr>
         <w:trPr>
@@ -11593,7 +11557,7 @@
         </w:tc>
         <w:tc>
           <w:tcPr>
-            <w:tcW w:w="0" w:type="auto"/>
+            <w:tcW w:w="8881" w:type="dxa"/>
           </w:tcPr>
           <w:p>
             <w:pPr>
@@ -11626,7 +11590,7 @@
         </w:tc>
         <w:tc>
           <w:tcPr>
-            <w:tcW w:w="0" w:type="auto"/>
+            <w:tcW w:w="8881" w:type="dxa"/>
           </w:tcPr>
           <w:p>
             <w:pPr>
@@ -11656,7 +11620,7 @@
         </w:tc>
         <w:tc>
           <w:tcPr>
-            <w:tcW w:w="0" w:type="auto"/>
+            <w:tcW w:w="8881" w:type="dxa"/>
           </w:tcPr>
           <w:p>
             <w:pPr>
@@ -11683,16 +11647,13 @@
               <w:pStyle w:val="Compact"/>
             </w:pPr>
             <w:r>
-              <w:t>Flash</w:t>
-            </w:r>
-            <w:r>
-              <w:t xml:space="preserve"> at 2Hz</w:t>
-            </w:r>
-          </w:p>
-        </w:tc>
-        <w:tc>
-          <w:tcPr>
-            <w:tcW w:w="0" w:type="auto"/>
+              <w:t>Flashes</w:t>
+            </w:r>
+          </w:p>
+        </w:tc>
+        <w:tc>
+          <w:tcPr>
+            <w:tcW w:w="8881" w:type="dxa"/>
           </w:tcPr>
           <w:p>
             <w:pPr>
@@ -11700,27 +11661,10 @@
               <w:cnfStyle w:val="000000100000" w:firstRow="0" w:lastRow="0" w:firstColumn="0" w:lastColumn="0" w:oddVBand="0" w:evenVBand="0" w:oddHBand="1" w:evenHBand="0" w:firstRowFirstColumn="0" w:firstRowLastColumn="0" w:lastRowFirstColumn="0" w:lastRowLastColumn="0"/>
             </w:pPr>
             <w:r>
-              <w:t>Along with the EStop</w:t>
-            </w:r>
-            <w:r>
-              <w:t xml:space="preserve"> LED, </w:t>
-            </w:r>
-            <w:proofErr w:type="gramStart"/>
-            <w:r>
-              <w:t>indicates</w:t>
-            </w:r>
-            <w:proofErr w:type="gramEnd"/>
-            <w:r>
-              <w:t xml:space="preserve"> </w:t>
-            </w:r>
-            <w:r>
-              <w:t>a</w:t>
-            </w:r>
-            <w:r>
-              <w:t xml:space="preserve"> faulty</w:t>
-            </w:r>
-            <w:r>
-              <w:t xml:space="preserve"> relay</w:t>
+              <w:t xml:space="preserve">Detected a faulty relay and triggered an </w:t>
+            </w:r>
+            <w:r>
+              <w:t>EStop</w:t>
             </w:r>
           </w:p>
         </w:tc>
@@ -11736,13 +11680,13 @@
               <w:pStyle w:val="Compact"/>
             </w:pPr>
             <w:r>
-              <w:t>Blink</w:t>
-            </w:r>
-          </w:p>
-        </w:tc>
-        <w:tc>
-          <w:tcPr>
-            <w:tcW w:w="0" w:type="auto"/>
+              <w:t>Pulsed</w:t>
+            </w:r>
+          </w:p>
+        </w:tc>
+        <w:tc>
+          <w:tcPr>
+            <w:tcW w:w="8881" w:type="dxa"/>
           </w:tcPr>
           <w:p>
             <w:pPr>
@@ -16858,12 +16802,12 @@
         <w:tblLook w:val="0020" w:firstRow="1" w:lastRow="0" w:firstColumn="0" w:lastColumn="0" w:noHBand="0" w:noVBand="0"/>
       </w:tblPr>
       <w:tblGrid>
-        <w:gridCol w:w="1574"/>
-        <w:gridCol w:w="1497"/>
+        <w:gridCol w:w="1554"/>
+        <w:gridCol w:w="1481"/>
         <w:gridCol w:w="885"/>
-        <w:gridCol w:w="2469"/>
-        <w:gridCol w:w="1369"/>
-        <w:gridCol w:w="1782"/>
+        <w:gridCol w:w="2429"/>
+        <w:gridCol w:w="1355"/>
+        <w:gridCol w:w="1872"/>
       </w:tblGrid>
       <w:tr>
         <w:trPr>
@@ -17032,6 +16976,15 @@
           <w:tcPr>
             <w:tcW w:w="0" w:type="auto"/>
           </w:tcPr>
+          <w:p>
+            <w:pPr>
+              <w:pStyle w:val="Compact"/>
+              <w:cnfStyle w:val="000000100000" w:firstRow="0" w:lastRow="0" w:firstColumn="0" w:lastColumn="0" w:oddVBand="0" w:evenVBand="0" w:oddHBand="1" w:evenHBand="0" w:firstRowFirstColumn="0" w:firstRowLastColumn="0" w:lastRowFirstColumn="0" w:lastRowLastColumn="0"/>
+            </w:pPr>
+            <w:r>
+              <w:t>0=Ignored</w:t>
+            </w:r>
+          </w:p>
           <w:p>
             <w:pPr>
               <w:pStyle w:val="Compact"/>
@@ -18007,6 +17960,7 @@
               <w:pStyle w:val="Compact"/>
             </w:pPr>
             <w:r>
+              <w:lastRenderedPageBreak/>
               <w:t>40021</w:t>
             </w:r>
           </w:p>
@@ -18049,11 +18003,7 @@
               <w:cnfStyle w:val="000000100000" w:firstRow="0" w:lastRow="0" w:firstColumn="0" w:lastColumn="0" w:oddVBand="0" w:evenVBand="0" w:oddHBand="1" w:evenHBand="0" w:firstRowFirstColumn="0" w:firstRowLastColumn="0" w:lastRowFirstColumn="0" w:lastRowLastColumn="0"/>
             </w:pPr>
             <w:r>
-              <w:t xml:space="preserve">Mask to open relays on electrical </w:t>
-            </w:r>
-            <w:r>
-              <w:lastRenderedPageBreak/>
-              <w:t>infeed fault</w:t>
+              <w:t>Mask to open relays on electrical infeed fault</w:t>
             </w:r>
             <w:r>
               <w:t xml:space="preserve">, </w:t>
@@ -18112,7 +18062,6 @@
               <w:pStyle w:val="Compact"/>
             </w:pPr>
             <w:r>
-              <w:lastRenderedPageBreak/>
               <w:t>0</w:t>
             </w:r>
           </w:p>
@@ -18185,7 +18134,6 @@
               <w:pStyle w:val="Compact"/>
             </w:pPr>
             <w:r>
-              <w:lastRenderedPageBreak/>
               <w:t>40022</w:t>
             </w:r>
           </w:p>
@@ -20714,7 +20662,7 @@
     <w:p>
       <w:r>
         <w:pict w14:anchorId="6957E5A4">
-          <v:rect id="_x0000_i1025" style="width:0;height:1.5pt" o:hralign="center" o:hrstd="t" o:hr="t"/>
+          <v:rect id="_x0000_i1070" style="width:0;height:1.5pt" o:hralign="center" o:hrstd="t" o:hr="t"/>
         </w:pict>
       </w:r>
     </w:p>

</xml_diff>